<commit_message>
Registra logout y abandono al cerrar, permite consultar el XML y mejora backup/restore
- FormClosing: logout de ambos jugadores tambien al cerrar con la X; si hay
  partida en curso pide confirmacion y la registra como abandonada.
- Boton "Ver movimientos" en Estadisticas: lee el XML de la partida elegida
  (BE.MOVIMIENTO, MOVIMIENTOXML.LeerMovimientos) y lo muestra en FormMovimientos.
- Cadena de conexion movida a App.config (ConfigurationManager).
- Backup/Restore: dialogos en la carpeta de backups de SQL Server, muestran el
  error real, RESTORE WITH REPLACE, y se deshabilitan durante la partida.
- Actualiza docx y AUDITORIA.
</commit_message>
<xml_diff>
--- a/Documentacion/TP_Generala_Documentacion.docx
+++ b/Documentacion/TP_Generala_Documentacion.docx
@@ -537,6 +537,20 @@
     </w:p>
     <w:p>
       <w:pPr>
+        <w:pStyle w:val="Bullet"/>
+      </w:pPr>
+      <w:r>
+        <w:rPr>
+          <w:b/>
+        </w:rPr>
+        <w:t>MOVIMIENTO</w:t>
+      </w:r>
+      <w:r>
+        <w:t> — una jugada leída del XML de la partida (turno, jugador, dados, categoría, puntaje y fecha), para consultarla desde la app.</w:t>
+      </w:r>
+    </w:p>
+    <w:p>
+      <w:pPr>
         <w:pStyle w:val="Heading2"/>
       </w:pPr>
       <w:r>
@@ -554,7 +568,7 @@
         <w:t>ACCESO</w:t>
       </w:r>
       <w:r>
-        <w:t> — abre/cierra la conexión y ejecuta los stored procedures (Escribir, Leer, LeerEscalar).</w:t>
+        <w:t> — abre/cierra la conexión y ejecuta los stored procedures (Escribir, Leer, LeerEscalar). La cadena de conexión se lee del App.config.</w:t>
       </w:r>
     </w:p>
     <w:p>
@@ -582,7 +596,7 @@
         <w:t>BACKUPRESTORE</w:t>
       </w:r>
       <w:r>
-        <w:t> — BACKUP/RESTORE DATABASE contra la conexión a "master".</w:t>
+        <w:t> — BACKUP/RESTORE DATABASE contra la conexión a "master", y consulta la carpeta de backups de la instancia de SQL Server.</w:t>
       </w:r>
     </w:p>
     <w:p>
@@ -674,7 +688,7 @@
         <w:t>MOVIMIENTOXML</w:t>
       </w:r>
       <w:r>
-        <w:t> — crea el archivo XML de la partida y le agrega un nodo por cada jugada.</w:t>
+        <w:t> — crea el archivo XML de la partida, le agrega un nodo por cada jugada y lo vuelve a leer para su consulta.</w:t>
       </w:r>
     </w:p>
     <w:p>
@@ -738,7 +752,21 @@
         <w:t>FormEstadisticas</w:t>
       </w:r>
       <w:r>
-        <w:t> — historial de partidas, porcentaje de victorias y tiempo total jugado.</w:t>
+        <w:t> — historial de partidas, porcentaje de victorias y tiempo total jugado, con un botón para ver los movimientos de la partida elegida.</w:t>
+      </w:r>
+    </w:p>
+    <w:p>
+      <w:pPr>
+        <w:pStyle w:val="Bullet"/>
+      </w:pPr>
+      <w:r>
+        <w:rPr>
+          <w:b/>
+        </w:rPr>
+        <w:t>FormMovimientos</w:t>
+      </w:r>
+      <w:r>
+        <w:t> — muestra en una grilla los movimientos guardados en el XML de una partida.</w:t>
       </w:r>
     </w:p>
     <w:p>
@@ -814,7 +842,7 @@
         <w:pStyle w:val="Bullet"/>
       </w:pPr>
       <w:r>
-        <w:t>• Bitácora de inicio/cierre de sesión e inicio/fin de partida (incluido el cierre de sesión del Jugador 2 anterior cuando entra otro distinto).</w:t>
+        <w:t>• Bitácora de inicio/cierre de sesión e inicio/fin de partida (incluido el cierre de sesión del Jugador 2 anterior cuando entra otro distinto). El logout también se registra si se cierra la ventana con la X, y si se sale con una partida en curso, la partida se registra como abandonada.</w:t>
       </w:r>
     </w:p>
     <w:p>
@@ -830,15 +858,15 @@
         <w:pStyle w:val="Bullet"/>
       </w:pPr>
       <w:r>
-        <w:t>• Cada movimiento de cada partida se graba en un archivo XML propio para su consulta posterior.</w:t>
-      </w:r>
-    </w:p>
-    <w:p>
-      <w:pPr>
-        <w:pStyle w:val="Bullet"/>
-      </w:pPr>
-      <w:r>
-        <w:t>• Backup y Restore de la base de datos GENERALA desde la propia aplicación.</w:t>
+        <w:t>• Cada movimiento de cada partida se graba en un archivo XML propio, que se puede consultar después desde Estadísticas → Ver movimientos.</w:t>
+      </w:r>
+    </w:p>
+    <w:p>
+      <w:pPr>
+        <w:pStyle w:val="Bullet"/>
+      </w:pPr>
+      <w:r>
+        <w:t>• Backup y Restore de la base de datos GENERALA desde la propia aplicación. Los diálogos arrancan en la carpeta de backups de SQL Server, si algo falla se muestra el error real, y no se pueden usar con una partida en juego.</w:t>
       </w:r>
     </w:p>
     <w:p>
@@ -847,6 +875,14 @@
       </w:pPr>
       <w:r>
         <w:t>• Manejo de errores de conexión sin cerrar la aplicación de golpe (revisión de robustez posterior a la entrega inicial).</w:t>
+      </w:r>
+    </w:p>
+    <w:p>
+      <w:pPr>
+        <w:pStyle w:val="Bullet"/>
+      </w:pPr>
+      <w:r>
+        <w:t>• Cadena de conexión configurable en GUI/App.config: para usar otra instancia de SQL Server alcanza con cambiar el Data Source, sin recompilar.</w:t>
       </w:r>
     </w:p>
     <w:p>

</xml_diff>

<commit_message>
Elegir quien abandona, login renovado, confirmaciones y reglas de usuario
- FormAbandonar: se elige que jugador abandona (antes era siempre el del turno)
- BLL.PARTIDA.Abandonar(quienAbandona); la bitacora registra quien abandono
- Login en 2 columnas, Enter para ingresar, modo Jugador 2
- Confirmacion al tachar una categoria y al salir; boton Salir distinto
- Jugador 2 ingresado se marca con un tilde y "Cambiar Jugador 2"
- Usuario de 3 a 20 caracteres sin espacios; contrasena de 4 a 20 con al menos un numero
- Errores de SQL Server en espanol (Current Language=Spanish)
- Tiempo total jugado con segundos
- Reglas, README y Word actualizados

Co-Authored-By: Claude Opus 5.5 <noreply@anthropic.com>
</commit_message>
<xml_diff>
--- a/Documentacion/TP_Generala_Documentacion.docx
+++ b/Documentacion/TP_Generala_Documentacion.docx
@@ -129,12 +129,6 @@
         <w:gridCol w:w="7050"/>
       </w:tblGrid>
       <w:tr>
-        <w:tblPrEx>
-          <w:tblCellMar>
-            <w:top w:w="0" w:type="dxa"/>
-            <w:bottom w:w="0" w:type="dxa"/>
-          </w:tblCellMar>
-        </w:tblPrEx>
         <w:tc>
           <w:tcPr>
             <w:tcW w:w="2700" w:type="dxa"/>
@@ -375,12 +369,6 @@
         <w:gridCol w:w="3000"/>
       </w:tblGrid>
       <w:tr>
-        <w:tblPrEx>
-          <w:tblCellMar>
-            <w:top w:w="0" w:type="dxa"/>
-            <w:bottom w:w="0" w:type="dxa"/>
-          </w:tblCellMar>
-        </w:tblPrEx>
         <w:tc>
           <w:tcPr>
             <w:tcW w:w="3250" w:type="dxa"/>
@@ -522,12 +510,6 @@
         </w:tc>
       </w:tr>
       <w:tr>
-        <w:tblPrEx>
-          <w:tblCellMar>
-            <w:top w:w="0" w:type="dxa"/>
-            <w:bottom w:w="0" w:type="dxa"/>
-          </w:tblCellMar>
-        </w:tblPrEx>
         <w:tc>
           <w:tcPr>
             <w:tcW w:w="3250" w:type="dxa"/>
@@ -3456,12 +3438,6 @@
         <w:gridCol w:w="1300"/>
       </w:tblGrid>
       <w:tr>
-        <w:tblPrEx>
-          <w:tblCellMar>
-            <w:top w:w="0" w:type="dxa"/>
-            <w:bottom w:w="0" w:type="dxa"/>
-          </w:tblCellMar>
-        </w:tblPrEx>
         <w:trPr>
           <w:tblHeader/>
         </w:trPr>
@@ -3605,12 +3581,6 @@
         </w:tc>
       </w:tr>
       <w:tr>
-        <w:tblPrEx>
-          <w:tblCellMar>
-            <w:top w:w="0" w:type="dxa"/>
-            <w:bottom w:w="0" w:type="dxa"/>
-          </w:tblCellMar>
-        </w:tblPrEx>
         <w:trPr>
           <w:cantSplit/>
         </w:trPr>
@@ -3749,12 +3719,6 @@
         </w:tc>
       </w:tr>
       <w:tr>
-        <w:tblPrEx>
-          <w:tblCellMar>
-            <w:top w:w="0" w:type="dxa"/>
-            <w:bottom w:w="0" w:type="dxa"/>
-          </w:tblCellMar>
-        </w:tblPrEx>
         <w:trPr>
           <w:cantSplit/>
         </w:trPr>
@@ -3893,12 +3857,6 @@
         </w:tc>
       </w:tr>
       <w:tr>
-        <w:tblPrEx>
-          <w:tblCellMar>
-            <w:top w:w="0" w:type="dxa"/>
-            <w:bottom w:w="0" w:type="dxa"/>
-          </w:tblCellMar>
-        </w:tblPrEx>
         <w:trPr>
           <w:cantSplit/>
         </w:trPr>
@@ -4037,12 +3995,6 @@
         </w:tc>
       </w:tr>
       <w:tr>
-        <w:tblPrEx>
-          <w:tblCellMar>
-            <w:top w:w="0" w:type="dxa"/>
-            <w:bottom w:w="0" w:type="dxa"/>
-          </w:tblCellMar>
-        </w:tblPrEx>
         <w:trPr>
           <w:cantSplit/>
         </w:trPr>
@@ -4181,12 +4133,6 @@
         </w:tc>
       </w:tr>
       <w:tr>
-        <w:tblPrEx>
-          <w:tblCellMar>
-            <w:top w:w="0" w:type="dxa"/>
-            <w:bottom w:w="0" w:type="dxa"/>
-          </w:tblCellMar>
-        </w:tblPrEx>
         <w:trPr>
           <w:cantSplit/>
         </w:trPr>
@@ -4325,12 +4271,6 @@
         </w:tc>
       </w:tr>
       <w:tr>
-        <w:tblPrEx>
-          <w:tblCellMar>
-            <w:top w:w="0" w:type="dxa"/>
-            <w:bottom w:w="0" w:type="dxa"/>
-          </w:tblCellMar>
-        </w:tblPrEx>
         <w:trPr>
           <w:cantSplit/>
         </w:trPr>
@@ -4536,17 +4476,7 @@
         <w:spacing w:after="70" w:line="276" w:lineRule="auto"/>
       </w:pPr>
       <w:r>
-        <w:t xml:space="preserve">La partida puede </w:t>
-      </w:r>
-      <w:r>
-        <w:rPr>
-          <w:b/>
-          <w:bCs/>
-        </w:rPr>
-        <w:t>abandonarse</w:t>
-      </w:r>
-      <w:r>
-        <w:t xml:space="preserve"> en curso: abandona el jugador del turno actual, se guardan los puntajes parciales y la partida la gana siempre el rival.</w:t>
+        <w:t>La partida puede abandonarse en curso: la aplicación pregunta qué jugador abandona (cualquiera de los dos, le toque o no el turno), se guardan los puntajes parciales y la partida la gana siempre el otro jugador.</w:t>
       </w:r>
     </w:p>
     <w:p>
@@ -4561,27 +4491,7 @@
         <w:spacing w:after="70" w:line="276" w:lineRule="auto"/>
       </w:pPr>
       <w:r>
-        <w:t xml:space="preserve">Si se cierra la aplicación (botón </w:t>
-      </w:r>
-      <w:r>
-        <w:rPr>
-          <w:i/>
-          <w:iCs/>
-        </w:rPr>
-        <w:t>Salir</w:t>
-      </w:r>
-      <w:r>
-        <w:t xml:space="preserve"> o la X de la ventana) con una partida en curso, se pide confirmación y la partida se registra como </w:t>
-      </w:r>
-      <w:r>
-        <w:rPr>
-          <w:b/>
-          <w:bCs/>
-        </w:rPr>
-        <w:t>abandonada</w:t>
-      </w:r>
-      <w:r>
-        <w:t xml:space="preserve"> por el jugador del turno; si no se confirma, el cierre se cancela.</w:t>
+        <w:t>Si se cierra la aplicación (botón Salir o la X de la ventana) con una partida en curso, se pide elegir qué jugador abandona y la partida se registra como abandonada por ese jugador; si se cancela, la aplicación no se cierra.</w:t>
       </w:r>
     </w:p>
     <w:p>
@@ -4749,12 +4659,6 @@
         <w:gridCol w:w="6912"/>
       </w:tblGrid>
       <w:tr>
-        <w:tblPrEx>
-          <w:tblCellMar>
-            <w:top w:w="0" w:type="dxa"/>
-            <w:bottom w:w="0" w:type="dxa"/>
-          </w:tblCellMar>
-        </w:tblPrEx>
         <w:trPr>
           <w:tblHeader/>
         </w:trPr>
@@ -4828,12 +4732,6 @@
         </w:tc>
       </w:tr>
       <w:tr>
-        <w:tblPrEx>
-          <w:tblCellMar>
-            <w:top w:w="0" w:type="dxa"/>
-            <w:bottom w:w="0" w:type="dxa"/>
-          </w:tblCellMar>
-        </w:tblPrEx>
         <w:trPr>
           <w:cantSplit/>
         </w:trPr>
@@ -4906,12 +4804,6 @@
         </w:tc>
       </w:tr>
       <w:tr>
-        <w:tblPrEx>
-          <w:tblCellMar>
-            <w:top w:w="0" w:type="dxa"/>
-            <w:bottom w:w="0" w:type="dxa"/>
-          </w:tblCellMar>
-        </w:tblPrEx>
         <w:trPr>
           <w:cantSplit/>
         </w:trPr>
@@ -4984,12 +4876,6 @@
         </w:tc>
       </w:tr>
       <w:tr>
-        <w:tblPrEx>
-          <w:tblCellMar>
-            <w:top w:w="0" w:type="dxa"/>
-            <w:bottom w:w="0" w:type="dxa"/>
-          </w:tblCellMar>
-        </w:tblPrEx>
         <w:trPr>
           <w:cantSplit/>
         </w:trPr>
@@ -5062,12 +4948,6 @@
         </w:tc>
       </w:tr>
       <w:tr>
-        <w:tblPrEx>
-          <w:tblCellMar>
-            <w:top w:w="0" w:type="dxa"/>
-            <w:bottom w:w="0" w:type="dxa"/>
-          </w:tblCellMar>
-        </w:tblPrEx>
         <w:trPr>
           <w:cantSplit/>
         </w:trPr>
@@ -5186,12 +5066,6 @@
         <w:gridCol w:w="6912"/>
       </w:tblGrid>
       <w:tr>
-        <w:tblPrEx>
-          <w:tblCellMar>
-            <w:top w:w="0" w:type="dxa"/>
-            <w:bottom w:w="0" w:type="dxa"/>
-          </w:tblCellMar>
-        </w:tblPrEx>
         <w:trPr>
           <w:tblHeader/>
         </w:trPr>
@@ -5265,12 +5139,6 @@
         </w:tc>
       </w:tr>
       <w:tr>
-        <w:tblPrEx>
-          <w:tblCellMar>
-            <w:top w:w="0" w:type="dxa"/>
-            <w:bottom w:w="0" w:type="dxa"/>
-          </w:tblCellMar>
-        </w:tblPrEx>
         <w:trPr>
           <w:cantSplit/>
         </w:trPr>
@@ -5343,12 +5211,6 @@
         </w:tc>
       </w:tr>
       <w:tr>
-        <w:tblPrEx>
-          <w:tblCellMar>
-            <w:top w:w="0" w:type="dxa"/>
-            <w:bottom w:w="0" w:type="dxa"/>
-          </w:tblCellMar>
-        </w:tblPrEx>
         <w:trPr>
           <w:cantSplit/>
         </w:trPr>
@@ -5421,12 +5283,6 @@
         </w:tc>
       </w:tr>
       <w:tr>
-        <w:tblPrEx>
-          <w:tblCellMar>
-            <w:top w:w="0" w:type="dxa"/>
-            <w:bottom w:w="0" w:type="dxa"/>
-          </w:tblCellMar>
-        </w:tblPrEx>
         <w:trPr>
           <w:cantSplit/>
         </w:trPr>
@@ -5499,12 +5355,6 @@
         </w:tc>
       </w:tr>
       <w:tr>
-        <w:tblPrEx>
-          <w:tblCellMar>
-            <w:top w:w="0" w:type="dxa"/>
-            <w:bottom w:w="0" w:type="dxa"/>
-          </w:tblCellMar>
-        </w:tblPrEx>
         <w:trPr>
           <w:cantSplit/>
         </w:trPr>
@@ -5577,12 +5427,6 @@
         </w:tc>
       </w:tr>
       <w:tr>
-        <w:tblPrEx>
-          <w:tblCellMar>
-            <w:top w:w="0" w:type="dxa"/>
-            <w:bottom w:w="0" w:type="dxa"/>
-          </w:tblCellMar>
-        </w:tblPrEx>
         <w:trPr>
           <w:cantSplit/>
         </w:trPr>
@@ -5653,12 +5497,6 @@
         </w:tc>
       </w:tr>
       <w:tr>
-        <w:tblPrEx>
-          <w:tblCellMar>
-            <w:top w:w="0" w:type="dxa"/>
-            <w:bottom w:w="0" w:type="dxa"/>
-          </w:tblCellMar>
-        </w:tblPrEx>
         <w:trPr>
           <w:cantSplit/>
         </w:trPr>
@@ -5740,12 +5578,6 @@
         </w:tc>
       </w:tr>
       <w:tr>
-        <w:tblPrEx>
-          <w:tblCellMar>
-            <w:top w:w="0" w:type="dxa"/>
-            <w:bottom w:w="0" w:type="dxa"/>
-          </w:tblCellMar>
-        </w:tblPrEx>
         <w:trPr>
           <w:cantSplit/>
         </w:trPr>
@@ -5860,12 +5692,6 @@
         <w:gridCol w:w="6912"/>
       </w:tblGrid>
       <w:tr>
-        <w:tblPrEx>
-          <w:tblCellMar>
-            <w:top w:w="0" w:type="dxa"/>
-            <w:bottom w:w="0" w:type="dxa"/>
-          </w:tblCellMar>
-        </w:tblPrEx>
         <w:trPr>
           <w:tblHeader/>
         </w:trPr>
@@ -5939,12 +5765,6 @@
         </w:tc>
       </w:tr>
       <w:tr>
-        <w:tblPrEx>
-          <w:tblCellMar>
-            <w:top w:w="0" w:type="dxa"/>
-            <w:bottom w:w="0" w:type="dxa"/>
-          </w:tblCellMar>
-        </w:tblPrEx>
         <w:trPr>
           <w:cantSplit/>
         </w:trPr>
@@ -6017,12 +5837,6 @@
         </w:tc>
       </w:tr>
       <w:tr>
-        <w:tblPrEx>
-          <w:tblCellMar>
-            <w:top w:w="0" w:type="dxa"/>
-            <w:bottom w:w="0" w:type="dxa"/>
-          </w:tblCellMar>
-        </w:tblPrEx>
         <w:trPr>
           <w:cantSplit/>
         </w:trPr>
@@ -6095,12 +5909,6 @@
         </w:tc>
       </w:tr>
       <w:tr>
-        <w:tblPrEx>
-          <w:tblCellMar>
-            <w:top w:w="0" w:type="dxa"/>
-            <w:bottom w:w="0" w:type="dxa"/>
-          </w:tblCellMar>
-        </w:tblPrEx>
         <w:trPr>
           <w:cantSplit/>
         </w:trPr>
@@ -6173,12 +5981,6 @@
         </w:tc>
       </w:tr>
       <w:tr>
-        <w:tblPrEx>
-          <w:tblCellMar>
-            <w:top w:w="0" w:type="dxa"/>
-            <w:bottom w:w="0" w:type="dxa"/>
-          </w:tblCellMar>
-        </w:tblPrEx>
         <w:trPr>
           <w:cantSplit/>
         </w:trPr>
@@ -6251,12 +6053,6 @@
         </w:tc>
       </w:tr>
       <w:tr>
-        <w:tblPrEx>
-          <w:tblCellMar>
-            <w:top w:w="0" w:type="dxa"/>
-            <w:bottom w:w="0" w:type="dxa"/>
-          </w:tblCellMar>
-        </w:tblPrEx>
         <w:trPr>
           <w:cantSplit/>
         </w:trPr>
@@ -6331,12 +6127,6 @@
         </w:tc>
       </w:tr>
       <w:tr>
-        <w:tblPrEx>
-          <w:tblCellMar>
-            <w:top w:w="0" w:type="dxa"/>
-            <w:bottom w:w="0" w:type="dxa"/>
-          </w:tblCellMar>
-        </w:tblPrEx>
         <w:trPr>
           <w:cantSplit/>
         </w:trPr>
@@ -6426,7 +6216,6 @@
       </w:pPr>
       <w:bookmarkStart w:id="12" w:name="_Toc242784283"/>
       <w:r>
-        <w:lastRenderedPageBreak/>
         <w:t>5.3 BLL: Lógica de negocio</w:t>
       </w:r>
       <w:bookmarkEnd w:id="12"/>
@@ -6454,12 +6243,6 @@
         <w:gridCol w:w="6912"/>
       </w:tblGrid>
       <w:tr>
-        <w:tblPrEx>
-          <w:tblCellMar>
-            <w:top w:w="0" w:type="dxa"/>
-            <w:bottom w:w="0" w:type="dxa"/>
-          </w:tblCellMar>
-        </w:tblPrEx>
         <w:trPr>
           <w:tblHeader/>
         </w:trPr>
@@ -6533,12 +6316,6 @@
         </w:tc>
       </w:tr>
       <w:tr>
-        <w:tblPrEx>
-          <w:tblCellMar>
-            <w:top w:w="0" w:type="dxa"/>
-            <w:bottom w:w="0" w:type="dxa"/>
-          </w:tblCellMar>
-        </w:tblPrEx>
         <w:trPr>
           <w:cantSplit/>
         </w:trPr>
@@ -6611,12 +6388,6 @@
         </w:tc>
       </w:tr>
       <w:tr>
-        <w:tblPrEx>
-          <w:tblCellMar>
-            <w:top w:w="0" w:type="dxa"/>
-            <w:bottom w:w="0" w:type="dxa"/>
-          </w:tblCellMar>
-        </w:tblPrEx>
         <w:trPr>
           <w:cantSplit/>
         </w:trPr>
@@ -6689,12 +6460,6 @@
         </w:tc>
       </w:tr>
       <w:tr>
-        <w:tblPrEx>
-          <w:tblCellMar>
-            <w:top w:w="0" w:type="dxa"/>
-            <w:bottom w:w="0" w:type="dxa"/>
-          </w:tblCellMar>
-        </w:tblPrEx>
         <w:trPr>
           <w:cantSplit/>
         </w:trPr>
@@ -6767,12 +6532,6 @@
         </w:tc>
       </w:tr>
       <w:tr>
-        <w:tblPrEx>
-          <w:tblCellMar>
-            <w:top w:w="0" w:type="dxa"/>
-            <w:bottom w:w="0" w:type="dxa"/>
-          </w:tblCellMar>
-        </w:tblPrEx>
         <w:trPr>
           <w:cantSplit/>
         </w:trPr>
@@ -6845,12 +6604,6 @@
         </w:tc>
       </w:tr>
       <w:tr>
-        <w:tblPrEx>
-          <w:tblCellMar>
-            <w:top w:w="0" w:type="dxa"/>
-            <w:bottom w:w="0" w:type="dxa"/>
-          </w:tblCellMar>
-        </w:tblPrEx>
         <w:trPr>
           <w:cantSplit/>
         </w:trPr>
@@ -6923,12 +6676,6 @@
         </w:tc>
       </w:tr>
       <w:tr>
-        <w:tblPrEx>
-          <w:tblCellMar>
-            <w:top w:w="0" w:type="dxa"/>
-            <w:bottom w:w="0" w:type="dxa"/>
-          </w:tblCellMar>
-        </w:tblPrEx>
         <w:trPr>
           <w:cantSplit/>
         </w:trPr>
@@ -7001,12 +6748,6 @@
         </w:tc>
       </w:tr>
       <w:tr>
-        <w:tblPrEx>
-          <w:tblCellMar>
-            <w:top w:w="0" w:type="dxa"/>
-            <w:bottom w:w="0" w:type="dxa"/>
-          </w:tblCellMar>
-        </w:tblPrEx>
         <w:trPr>
           <w:cantSplit/>
         </w:trPr>
@@ -7077,12 +6818,6 @@
         </w:tc>
       </w:tr>
       <w:tr>
-        <w:tblPrEx>
-          <w:tblCellMar>
-            <w:top w:w="0" w:type="dxa"/>
-            <w:bottom w:w="0" w:type="dxa"/>
-          </w:tblCellMar>
-        </w:tblPrEx>
         <w:trPr>
           <w:cantSplit/>
         </w:trPr>
@@ -7197,12 +6932,6 @@
         <w:gridCol w:w="6912"/>
       </w:tblGrid>
       <w:tr>
-        <w:tblPrEx>
-          <w:tblCellMar>
-            <w:top w:w="0" w:type="dxa"/>
-            <w:bottom w:w="0" w:type="dxa"/>
-          </w:tblCellMar>
-        </w:tblPrEx>
         <w:trPr>
           <w:tblHeader/>
         </w:trPr>
@@ -7276,12 +7005,6 @@
         </w:tc>
       </w:tr>
       <w:tr>
-        <w:tblPrEx>
-          <w:tblCellMar>
-            <w:top w:w="0" w:type="dxa"/>
-            <w:bottom w:w="0" w:type="dxa"/>
-          </w:tblCellMar>
-        </w:tblPrEx>
         <w:trPr>
           <w:cantSplit/>
         </w:trPr>
@@ -7354,12 +7077,6 @@
         </w:tc>
       </w:tr>
       <w:tr>
-        <w:tblPrEx>
-          <w:tblCellMar>
-            <w:top w:w="0" w:type="dxa"/>
-            <w:bottom w:w="0" w:type="dxa"/>
-          </w:tblCellMar>
-        </w:tblPrEx>
         <w:trPr>
           <w:cantSplit/>
         </w:trPr>
@@ -7432,12 +7149,6 @@
         </w:tc>
       </w:tr>
       <w:tr>
-        <w:tblPrEx>
-          <w:tblCellMar>
-            <w:top w:w="0" w:type="dxa"/>
-            <w:bottom w:w="0" w:type="dxa"/>
-          </w:tblCellMar>
-        </w:tblPrEx>
         <w:trPr>
           <w:cantSplit/>
         </w:trPr>
@@ -7510,12 +7221,6 @@
         </w:tc>
       </w:tr>
       <w:tr>
-        <w:tblPrEx>
-          <w:tblCellMar>
-            <w:top w:w="0" w:type="dxa"/>
-            <w:bottom w:w="0" w:type="dxa"/>
-          </w:tblCellMar>
-        </w:tblPrEx>
         <w:trPr>
           <w:cantSplit/>
         </w:trPr>
@@ -7588,12 +7293,6 @@
         </w:tc>
       </w:tr>
       <w:tr>
-        <w:tblPrEx>
-          <w:tblCellMar>
-            <w:top w:w="0" w:type="dxa"/>
-            <w:bottom w:w="0" w:type="dxa"/>
-          </w:tblCellMar>
-        </w:tblPrEx>
         <w:trPr>
           <w:cantSplit/>
         </w:trPr>
@@ -7664,12 +7363,6 @@
         </w:tc>
       </w:tr>
       <w:tr>
-        <w:tblPrEx>
-          <w:tblCellMar>
-            <w:top w:w="0" w:type="dxa"/>
-            <w:bottom w:w="0" w:type="dxa"/>
-          </w:tblCellMar>
-        </w:tblPrEx>
         <w:trPr>
           <w:cantSplit/>
         </w:trPr>
@@ -7806,7 +7499,6 @@
         <w:rPr>
           <w:noProof/>
         </w:rPr>
-        <w:lastRenderedPageBreak/>
         <w:drawing>
           <wp:inline distT="0" distB="0" distL="0" distR="0" wp14:anchorId="71F10D9E" wp14:editId="47A4578A">
             <wp:extent cx="5120640" cy="4343400"/>
@@ -7912,12 +7604,6 @@
         <w:gridCol w:w="7412"/>
       </w:tblGrid>
       <w:tr>
-        <w:tblPrEx>
-          <w:tblCellMar>
-            <w:top w:w="0" w:type="dxa"/>
-            <w:bottom w:w="0" w:type="dxa"/>
-          </w:tblCellMar>
-        </w:tblPrEx>
         <w:trPr>
           <w:tblHeader/>
         </w:trPr>
@@ -7991,12 +7677,6 @@
         </w:tc>
       </w:tr>
       <w:tr>
-        <w:tblPrEx>
-          <w:tblCellMar>
-            <w:top w:w="0" w:type="dxa"/>
-            <w:bottom w:w="0" w:type="dxa"/>
-          </w:tblCellMar>
-        </w:tblPrEx>
         <w:trPr>
           <w:cantSplit/>
         </w:trPr>
@@ -8085,12 +7765,6 @@
         </w:tc>
       </w:tr>
       <w:tr>
-        <w:tblPrEx>
-          <w:tblCellMar>
-            <w:top w:w="0" w:type="dxa"/>
-            <w:bottom w:w="0" w:type="dxa"/>
-          </w:tblCellMar>
-        </w:tblPrEx>
         <w:trPr>
           <w:cantSplit/>
         </w:trPr>
@@ -8163,12 +7837,6 @@
         </w:tc>
       </w:tr>
       <w:tr>
-        <w:tblPrEx>
-          <w:tblCellMar>
-            <w:top w:w="0" w:type="dxa"/>
-            <w:bottom w:w="0" w:type="dxa"/>
-          </w:tblCellMar>
-        </w:tblPrEx>
         <w:trPr>
           <w:cantSplit/>
         </w:trPr>
@@ -8241,12 +7909,6 @@
         </w:tc>
       </w:tr>
       <w:tr>
-        <w:tblPrEx>
-          <w:tblCellMar>
-            <w:top w:w="0" w:type="dxa"/>
-            <w:bottom w:w="0" w:type="dxa"/>
-          </w:tblCellMar>
-        </w:tblPrEx>
         <w:trPr>
           <w:cantSplit/>
         </w:trPr>
@@ -8356,12 +8018,6 @@
         <w:gridCol w:w="6212"/>
       </w:tblGrid>
       <w:tr>
-        <w:tblPrEx>
-          <w:tblCellMar>
-            <w:top w:w="0" w:type="dxa"/>
-            <w:bottom w:w="0" w:type="dxa"/>
-          </w:tblCellMar>
-        </w:tblPrEx>
         <w:trPr>
           <w:tblHeader/>
         </w:trPr>
@@ -8435,12 +8091,6 @@
         </w:tc>
       </w:tr>
       <w:tr>
-        <w:tblPrEx>
-          <w:tblCellMar>
-            <w:top w:w="0" w:type="dxa"/>
-            <w:bottom w:w="0" w:type="dxa"/>
-          </w:tblCellMar>
-        </w:tblPrEx>
         <w:trPr>
           <w:cantSplit/>
         </w:trPr>
@@ -8513,12 +8163,6 @@
         </w:tc>
       </w:tr>
       <w:tr>
-        <w:tblPrEx>
-          <w:tblCellMar>
-            <w:top w:w="0" w:type="dxa"/>
-            <w:bottom w:w="0" w:type="dxa"/>
-          </w:tblCellMar>
-        </w:tblPrEx>
         <w:trPr>
           <w:cantSplit/>
         </w:trPr>
@@ -8591,12 +8235,6 @@
         </w:tc>
       </w:tr>
       <w:tr>
-        <w:tblPrEx>
-          <w:tblCellMar>
-            <w:top w:w="0" w:type="dxa"/>
-            <w:bottom w:w="0" w:type="dxa"/>
-          </w:tblCellMar>
-        </w:tblPrEx>
         <w:trPr>
           <w:cantSplit/>
         </w:trPr>
@@ -8669,12 +8307,6 @@
         </w:tc>
       </w:tr>
       <w:tr>
-        <w:tblPrEx>
-          <w:tblCellMar>
-            <w:top w:w="0" w:type="dxa"/>
-            <w:bottom w:w="0" w:type="dxa"/>
-          </w:tblCellMar>
-        </w:tblPrEx>
         <w:trPr>
           <w:cantSplit/>
         </w:trPr>
@@ -8747,12 +8379,6 @@
         </w:tc>
       </w:tr>
       <w:tr>
-        <w:tblPrEx>
-          <w:tblCellMar>
-            <w:top w:w="0" w:type="dxa"/>
-            <w:bottom w:w="0" w:type="dxa"/>
-          </w:tblCellMar>
-        </w:tblPrEx>
         <w:trPr>
           <w:cantSplit/>
         </w:trPr>
@@ -8825,12 +8451,6 @@
         </w:tc>
       </w:tr>
       <w:tr>
-        <w:tblPrEx>
-          <w:tblCellMar>
-            <w:top w:w="0" w:type="dxa"/>
-            <w:bottom w:w="0" w:type="dxa"/>
-          </w:tblCellMar>
-        </w:tblPrEx>
         <w:trPr>
           <w:cantSplit/>
         </w:trPr>
@@ -8903,12 +8523,6 @@
         </w:tc>
       </w:tr>
       <w:tr>
-        <w:tblPrEx>
-          <w:tblCellMar>
-            <w:top w:w="0" w:type="dxa"/>
-            <w:bottom w:w="0" w:type="dxa"/>
-          </w:tblCellMar>
-        </w:tblPrEx>
         <w:trPr>
           <w:cantSplit/>
         </w:trPr>
@@ -8989,7 +8603,6 @@
         <w:rPr>
           <w:rFonts w:ascii="Calibri" w:eastAsia="Calibri" w:hAnsi="Calibri" w:cs="Calibri"/>
         </w:rPr>
-        <w:lastRenderedPageBreak/>
         <w:t>7. Funcionalidades implementadas</w:t>
       </w:r>
       <w:bookmarkEnd w:id="15"/>
@@ -9284,7 +8897,6 @@
         <w:rPr>
           <w:rFonts w:ascii="Calibri" w:eastAsia="Calibri" w:hAnsi="Calibri" w:cs="Calibri"/>
         </w:rPr>
-        <w:lastRenderedPageBreak/>
         <w:t>8. Bitácora, XML de movimientos y estadísticas</w:t>
       </w:r>
       <w:bookmarkEnd w:id="20"/>
@@ -9332,12 +8944,6 @@
         <w:gridCol w:w="6212"/>
       </w:tblGrid>
       <w:tr>
-        <w:tblPrEx>
-          <w:tblCellMar>
-            <w:top w:w="0" w:type="dxa"/>
-            <w:bottom w:w="0" w:type="dxa"/>
-          </w:tblCellMar>
-        </w:tblPrEx>
         <w:trPr>
           <w:tblHeader/>
         </w:trPr>
@@ -9446,12 +9052,6 @@
         </w:tc>
       </w:tr>
       <w:tr>
-        <w:tblPrEx>
-          <w:tblCellMar>
-            <w:top w:w="0" w:type="dxa"/>
-            <w:bottom w:w="0" w:type="dxa"/>
-          </w:tblCellMar>
-        </w:tblPrEx>
         <w:trPr>
           <w:cantSplit/>
         </w:trPr>
@@ -9557,12 +9157,6 @@
         </w:tc>
       </w:tr>
       <w:tr>
-        <w:tblPrEx>
-          <w:tblCellMar>
-            <w:top w:w="0" w:type="dxa"/>
-            <w:bottom w:w="0" w:type="dxa"/>
-          </w:tblCellMar>
-        </w:tblPrEx>
         <w:trPr>
           <w:cantSplit/>
         </w:trPr>
@@ -9684,12 +9278,6 @@
         </w:tc>
       </w:tr>
       <w:tr>
-        <w:tblPrEx>
-          <w:tblCellMar>
-            <w:top w:w="0" w:type="dxa"/>
-            <w:bottom w:w="0" w:type="dxa"/>
-          </w:tblCellMar>
-        </w:tblPrEx>
         <w:trPr>
           <w:cantSplit/>
         </w:trPr>
@@ -9811,12 +9399,6 @@
         </w:tc>
       </w:tr>
       <w:tr>
-        <w:tblPrEx>
-          <w:tblCellMar>
-            <w:top w:w="0" w:type="dxa"/>
-            <w:bottom w:w="0" w:type="dxa"/>
-          </w:tblCellMar>
-        </w:tblPrEx>
         <w:trPr>
           <w:cantSplit/>
         </w:trPr>
@@ -10225,12 +9807,6 @@
         <w:gridCol w:w="6412"/>
       </w:tblGrid>
       <w:tr>
-        <w:tblPrEx>
-          <w:tblCellMar>
-            <w:top w:w="0" w:type="dxa"/>
-            <w:bottom w:w="0" w:type="dxa"/>
-          </w:tblCellMar>
-        </w:tblPrEx>
         <w:trPr>
           <w:tblHeader/>
         </w:trPr>
@@ -10304,12 +9880,6 @@
         </w:tc>
       </w:tr>
       <w:tr>
-        <w:tblPrEx>
-          <w:tblCellMar>
-            <w:top w:w="0" w:type="dxa"/>
-            <w:bottom w:w="0" w:type="dxa"/>
-          </w:tblCellMar>
-        </w:tblPrEx>
         <w:trPr>
           <w:cantSplit/>
         </w:trPr>
@@ -10398,12 +9968,6 @@
         </w:tc>
       </w:tr>
       <w:tr>
-        <w:tblPrEx>
-          <w:tblCellMar>
-            <w:top w:w="0" w:type="dxa"/>
-            <w:bottom w:w="0" w:type="dxa"/>
-          </w:tblCellMar>
-        </w:tblPrEx>
         <w:trPr>
           <w:cantSplit/>
         </w:trPr>
@@ -10476,12 +10040,6 @@
         </w:tc>
       </w:tr>
       <w:tr>
-        <w:tblPrEx>
-          <w:tblCellMar>
-            <w:top w:w="0" w:type="dxa"/>
-            <w:bottom w:w="0" w:type="dxa"/>
-          </w:tblCellMar>
-        </w:tblPrEx>
         <w:trPr>
           <w:cantSplit/>
         </w:trPr>
@@ -10563,7 +10121,6 @@
         <w:rPr>
           <w:rFonts w:ascii="Calibri" w:eastAsia="Calibri" w:hAnsi="Calibri" w:cs="Calibri"/>
         </w:rPr>
-        <w:lastRenderedPageBreak/>
         <w:t>9. Matriz de cumplimiento de la consigna</w:t>
       </w:r>
       <w:bookmarkEnd w:id="24"/>
@@ -10609,12 +10166,6 @@
         <w:gridCol w:w="600"/>
       </w:tblGrid>
       <w:tr>
-        <w:tblPrEx>
-          <w:tblCellMar>
-            <w:top w:w="0" w:type="dxa"/>
-            <w:bottom w:w="0" w:type="dxa"/>
-          </w:tblCellMar>
-        </w:tblPrEx>
         <w:trPr>
           <w:tblHeader/>
         </w:trPr>
@@ -10757,12 +10308,6 @@
         </w:tc>
       </w:tr>
       <w:tr>
-        <w:tblPrEx>
-          <w:tblCellMar>
-            <w:top w:w="0" w:type="dxa"/>
-            <w:bottom w:w="0" w:type="dxa"/>
-          </w:tblCellMar>
-        </w:tblPrEx>
         <w:trPr>
           <w:cantSplit/>
         </w:trPr>
@@ -10922,12 +10467,6 @@
         </w:tc>
       </w:tr>
       <w:tr>
-        <w:tblPrEx>
-          <w:tblCellMar>
-            <w:top w:w="0" w:type="dxa"/>
-            <w:bottom w:w="0" w:type="dxa"/>
-          </w:tblCellMar>
-        </w:tblPrEx>
         <w:trPr>
           <w:cantSplit/>
         </w:trPr>
@@ -11071,12 +10610,6 @@
         </w:tc>
       </w:tr>
       <w:tr>
-        <w:tblPrEx>
-          <w:tblCellMar>
-            <w:top w:w="0" w:type="dxa"/>
-            <w:bottom w:w="0" w:type="dxa"/>
-          </w:tblCellMar>
-        </w:tblPrEx>
         <w:trPr>
           <w:cantSplit/>
         </w:trPr>
@@ -11243,12 +10776,6 @@
         </w:tc>
       </w:tr>
       <w:tr>
-        <w:tblPrEx>
-          <w:tblCellMar>
-            <w:top w:w="0" w:type="dxa"/>
-            <w:bottom w:w="0" w:type="dxa"/>
-          </w:tblCellMar>
-        </w:tblPrEx>
         <w:trPr>
           <w:cantSplit/>
         </w:trPr>
@@ -11431,12 +10958,6 @@
         </w:tc>
       </w:tr>
       <w:tr>
-        <w:tblPrEx>
-          <w:tblCellMar>
-            <w:top w:w="0" w:type="dxa"/>
-            <w:bottom w:w="0" w:type="dxa"/>
-          </w:tblCellMar>
-        </w:tblPrEx>
         <w:trPr>
           <w:cantSplit/>
         </w:trPr>
@@ -11617,12 +11138,6 @@
         <w:gridCol w:w="600"/>
       </w:tblGrid>
       <w:tr>
-        <w:tblPrEx>
-          <w:tblCellMar>
-            <w:top w:w="0" w:type="dxa"/>
-            <w:bottom w:w="0" w:type="dxa"/>
-          </w:tblCellMar>
-        </w:tblPrEx>
         <w:trPr>
           <w:tblHeader/>
         </w:trPr>
@@ -11765,12 +11280,6 @@
         </w:tc>
       </w:tr>
       <w:tr>
-        <w:tblPrEx>
-          <w:tblCellMar>
-            <w:top w:w="0" w:type="dxa"/>
-            <w:bottom w:w="0" w:type="dxa"/>
-          </w:tblCellMar>
-        </w:tblPrEx>
         <w:trPr>
           <w:cantSplit/>
         </w:trPr>
@@ -11912,12 +11421,6 @@
         </w:tc>
       </w:tr>
       <w:tr>
-        <w:tblPrEx>
-          <w:tblCellMar>
-            <w:top w:w="0" w:type="dxa"/>
-            <w:bottom w:w="0" w:type="dxa"/>
-          </w:tblCellMar>
-        </w:tblPrEx>
         <w:trPr>
           <w:cantSplit/>
         </w:trPr>
@@ -12061,12 +11564,6 @@
         </w:tc>
       </w:tr>
       <w:tr>
-        <w:tblPrEx>
-          <w:tblCellMar>
-            <w:top w:w="0" w:type="dxa"/>
-            <w:bottom w:w="0" w:type="dxa"/>
-          </w:tblCellMar>
-        </w:tblPrEx>
         <w:trPr>
           <w:cantSplit/>
         </w:trPr>
@@ -12210,12 +11707,6 @@
         </w:tc>
       </w:tr>
       <w:tr>
-        <w:tblPrEx>
-          <w:tblCellMar>
-            <w:top w:w="0" w:type="dxa"/>
-            <w:bottom w:w="0" w:type="dxa"/>
-          </w:tblCellMar>
-        </w:tblPrEx>
         <w:trPr>
           <w:cantSplit/>
         </w:trPr>
@@ -12359,12 +11850,6 @@
         </w:tc>
       </w:tr>
       <w:tr>
-        <w:tblPrEx>
-          <w:tblCellMar>
-            <w:top w:w="0" w:type="dxa"/>
-            <w:bottom w:w="0" w:type="dxa"/>
-          </w:tblCellMar>
-        </w:tblPrEx>
         <w:trPr>
           <w:cantSplit/>
         </w:trPr>
@@ -12540,12 +12025,6 @@
         </w:tc>
       </w:tr>
       <w:tr>
-        <w:tblPrEx>
-          <w:tblCellMar>
-            <w:top w:w="0" w:type="dxa"/>
-            <w:bottom w:w="0" w:type="dxa"/>
-          </w:tblCellMar>
-        </w:tblPrEx>
         <w:trPr>
           <w:cantSplit/>
         </w:trPr>
@@ -12696,12 +12175,6 @@
         </w:tc>
       </w:tr>
       <w:tr>
-        <w:tblPrEx>
-          <w:tblCellMar>
-            <w:top w:w="0" w:type="dxa"/>
-            <w:bottom w:w="0" w:type="dxa"/>
-          </w:tblCellMar>
-        </w:tblPrEx>
         <w:trPr>
           <w:cantSplit/>
         </w:trPr>
@@ -12845,12 +12318,6 @@
         </w:tc>
       </w:tr>
       <w:tr>
-        <w:tblPrEx>
-          <w:tblCellMar>
-            <w:top w:w="0" w:type="dxa"/>
-            <w:bottom w:w="0" w:type="dxa"/>
-          </w:tblCellMar>
-        </w:tblPrEx>
         <w:trPr>
           <w:cantSplit/>
         </w:trPr>
@@ -12994,12 +12461,6 @@
         </w:tc>
       </w:tr>
       <w:tr>
-        <w:tblPrEx>
-          <w:tblCellMar>
-            <w:top w:w="0" w:type="dxa"/>
-            <w:bottom w:w="0" w:type="dxa"/>
-          </w:tblCellMar>
-        </w:tblPrEx>
         <w:trPr>
           <w:cantSplit/>
         </w:trPr>
@@ -13175,12 +12636,6 @@
         </w:tc>
       </w:tr>
       <w:tr>
-        <w:tblPrEx>
-          <w:tblCellMar>
-            <w:top w:w="0" w:type="dxa"/>
-            <w:bottom w:w="0" w:type="dxa"/>
-          </w:tblCellMar>
-        </w:tblPrEx>
         <w:trPr>
           <w:cantSplit/>
         </w:trPr>
@@ -13324,12 +12779,6 @@
         </w:tc>
       </w:tr>
       <w:tr>
-        <w:tblPrEx>
-          <w:tblCellMar>
-            <w:top w:w="0" w:type="dxa"/>
-            <w:bottom w:w="0" w:type="dxa"/>
-          </w:tblCellMar>
-        </w:tblPrEx>
         <w:trPr>
           <w:cantSplit/>
         </w:trPr>
@@ -13473,12 +12922,6 @@
         </w:tc>
       </w:tr>
       <w:tr>
-        <w:tblPrEx>
-          <w:tblCellMar>
-            <w:top w:w="0" w:type="dxa"/>
-            <w:bottom w:w="0" w:type="dxa"/>
-          </w:tblCellMar>
-        </w:tblPrEx>
         <w:trPr>
           <w:cantSplit/>
         </w:trPr>
@@ -13640,7 +13083,6 @@
         <w:rPr>
           <w:rFonts w:ascii="Calibri" w:eastAsia="Calibri" w:hAnsi="Calibri" w:cs="Calibri"/>
         </w:rPr>
-        <w:lastRenderedPageBreak/>
         <w:t>10. Diagramas de clases</w:t>
       </w:r>
       <w:bookmarkEnd w:id="25"/>
@@ -13668,7 +13110,6 @@
         <w:rPr>
           <w:noProof/>
         </w:rPr>
-        <w:lastRenderedPageBreak/>
         <w:drawing>
           <wp:inline distT="0" distB="0" distL="0" distR="0" wp14:anchorId="6897AF64" wp14:editId="37A9E84C">
             <wp:extent cx="5090915" cy="5334000"/>
@@ -14006,7 +13447,7 @@
           <w:noProof/>
         </w:rPr>
         <w:drawing>
-          <wp:inline distT="0" distB="0" distL="0" distR="0" wp14:anchorId="0610FB9C" wp14:editId="10E24C78">
+          <wp:inline distT="0" distB="0" distL="0" distR="0" wp14:anchorId="0610FB9C" wp14:editId="55CEA3EE">
             <wp:extent cx="8778240" cy="4902695"/>
             <wp:effectExtent l="0" t="0" r="3810" b="0"/>
             <wp:docPr id="819468357" name="Picture 5"/>
@@ -14096,7 +13537,6 @@
         <w:rPr>
           <w:rFonts w:ascii="Calibri" w:eastAsia="Calibri" w:hAnsi="Calibri" w:cs="Calibri"/>
         </w:rPr>
-        <w:lastRenderedPageBreak/>
         <w:t>11. Instalación y ejecución</w:t>
       </w:r>
       <w:bookmarkEnd w:id="26"/>
@@ -14307,12 +13747,6 @@
         <w:gridCol w:w="3000"/>
       </w:tblGrid>
       <w:tr>
-        <w:tblPrEx>
-          <w:tblCellMar>
-            <w:top w:w="0" w:type="dxa"/>
-            <w:bottom w:w="0" w:type="dxa"/>
-          </w:tblCellMar>
-        </w:tblPrEx>
         <w:trPr>
           <w:tblHeader/>
         </w:trPr>
@@ -14387,12 +13821,6 @@
         </w:tc>
       </w:tr>
       <w:tr>
-        <w:tblPrEx>
-          <w:tblCellMar>
-            <w:top w:w="0" w:type="dxa"/>
-            <w:bottom w:w="0" w:type="dxa"/>
-          </w:tblCellMar>
-        </w:tblPrEx>
         <w:trPr>
           <w:cantSplit/>
         </w:trPr>
@@ -14463,12 +13891,6 @@
         </w:tc>
       </w:tr>
       <w:tr>
-        <w:tblPrEx>
-          <w:tblCellMar>
-            <w:top w:w="0" w:type="dxa"/>
-            <w:bottom w:w="0" w:type="dxa"/>
-          </w:tblCellMar>
-        </w:tblPrEx>
         <w:trPr>
           <w:cantSplit/>
         </w:trPr>
@@ -14539,12 +13961,6 @@
         </w:tc>
       </w:tr>
       <w:tr>
-        <w:tblPrEx>
-          <w:tblCellMar>
-            <w:top w:w="0" w:type="dxa"/>
-            <w:bottom w:w="0" w:type="dxa"/>
-          </w:tblCellMar>
-        </w:tblPrEx>
         <w:trPr>
           <w:cantSplit/>
         </w:trPr>

</xml_diff>

<commit_message>
Registra en el XML todas las tiradas y el cierre de la partida
- <Tirada> por cada tirada: numero, dados que salieron y dados guardados
- <Fin> al cerrar: puntajes, ganador y quien abandono
- Ver movimientos muestra tiradas, anotaciones (negrita) y cierre (resaltado)
- Los XML anteriores se siguen leyendo
- README, reglas y Word actualizados

Co-Authored-By: Claude Opus 5.5 <noreply@anthropic.com>
</commit_message>
<xml_diff>
--- a/Documentacion/TP_Generala_Documentacion.docx
+++ b/Documentacion/TP_Generala_Documentacion.docx
@@ -698,7 +698,7 @@
       <w:r>
         <w:fldChar w:fldCharType="separate"/>
       </w:r>
-      <w:hyperlink w:anchor="_Toc242784271" w:history="1">
+      <w:hyperlink w:anchor="_Toc242829595" w:history="1">
         <w:r>
           <w:rPr>
             <w:rStyle w:val="Hyperlink"/>
@@ -725,7 +725,7 @@
             <w:noProof/>
             <w:webHidden/>
           </w:rPr>
-          <w:instrText xml:space="preserve"> PAGEREF _Toc242784271 \h </w:instrText>
+          <w:instrText xml:space="preserve"> PAGEREF _Toc242829595 \h </w:instrText>
         </w:r>
         <w:r>
           <w:rPr>
@@ -772,7 +772,7 @@
           <w14:ligatures w14:val="standardContextual"/>
         </w:rPr>
       </w:pPr>
-      <w:hyperlink w:anchor="_Toc242784272" w:history="1">
+      <w:hyperlink w:anchor="_Toc242829596" w:history="1">
         <w:r>
           <w:rPr>
             <w:rStyle w:val="Hyperlink"/>
@@ -799,7 +799,7 @@
             <w:noProof/>
             <w:webHidden/>
           </w:rPr>
-          <w:instrText xml:space="preserve"> PAGEREF _Toc242784272 \h </w:instrText>
+          <w:instrText xml:space="preserve"> PAGEREF _Toc242829596 \h </w:instrText>
         </w:r>
         <w:r>
           <w:rPr>
@@ -848,7 +848,7 @@
           <w14:ligatures w14:val="standardContextual"/>
         </w:rPr>
       </w:pPr>
-      <w:hyperlink w:anchor="_Toc242784273" w:history="1">
+      <w:hyperlink w:anchor="_Toc242829597" w:history="1">
         <w:r>
           <w:rPr>
             <w:rStyle w:val="Hyperlink"/>
@@ -875,7 +875,7 @@
             <w:noProof/>
             <w:webHidden/>
           </w:rPr>
-          <w:instrText xml:space="preserve"> PAGEREF _Toc242784273 \h </w:instrText>
+          <w:instrText xml:space="preserve"> PAGEREF _Toc242829597 \h </w:instrText>
         </w:r>
         <w:r>
           <w:rPr>
@@ -924,7 +924,7 @@
           <w14:ligatures w14:val="standardContextual"/>
         </w:rPr>
       </w:pPr>
-      <w:hyperlink w:anchor="_Toc242784274" w:history="1">
+      <w:hyperlink w:anchor="_Toc242829598" w:history="1">
         <w:r>
           <w:rPr>
             <w:rStyle w:val="Hyperlink"/>
@@ -951,7 +951,7 @@
             <w:noProof/>
             <w:webHidden/>
           </w:rPr>
-          <w:instrText xml:space="preserve"> PAGEREF _Toc242784274 \h </w:instrText>
+          <w:instrText xml:space="preserve"> PAGEREF _Toc242829598 \h </w:instrText>
         </w:r>
         <w:r>
           <w:rPr>
@@ -998,7 +998,7 @@
           <w14:ligatures w14:val="standardContextual"/>
         </w:rPr>
       </w:pPr>
-      <w:hyperlink w:anchor="_Toc242784275" w:history="1">
+      <w:hyperlink w:anchor="_Toc242829599" w:history="1">
         <w:r>
           <w:rPr>
             <w:rStyle w:val="Hyperlink"/>
@@ -1025,7 +1025,7 @@
             <w:noProof/>
             <w:webHidden/>
           </w:rPr>
-          <w:instrText xml:space="preserve"> PAGEREF _Toc242784275 \h </w:instrText>
+          <w:instrText xml:space="preserve"> PAGEREF _Toc242829599 \h </w:instrText>
         </w:r>
         <w:r>
           <w:rPr>
@@ -1072,7 +1072,7 @@
           <w14:ligatures w14:val="standardContextual"/>
         </w:rPr>
       </w:pPr>
-      <w:hyperlink w:anchor="_Toc242784276" w:history="1">
+      <w:hyperlink w:anchor="_Toc242829600" w:history="1">
         <w:r>
           <w:rPr>
             <w:rStyle w:val="Hyperlink"/>
@@ -1099,7 +1099,7 @@
             <w:noProof/>
             <w:webHidden/>
           </w:rPr>
-          <w:instrText xml:space="preserve"> PAGEREF _Toc242784276 \h </w:instrText>
+          <w:instrText xml:space="preserve"> PAGEREF _Toc242829600 \h </w:instrText>
         </w:r>
         <w:r>
           <w:rPr>
@@ -1146,7 +1146,7 @@
           <w14:ligatures w14:val="standardContextual"/>
         </w:rPr>
       </w:pPr>
-      <w:hyperlink w:anchor="_Toc242784277" w:history="1">
+      <w:hyperlink w:anchor="_Toc242829601" w:history="1">
         <w:r>
           <w:rPr>
             <w:rStyle w:val="Hyperlink"/>
@@ -1173,7 +1173,7 @@
             <w:noProof/>
             <w:webHidden/>
           </w:rPr>
-          <w:instrText xml:space="preserve"> PAGEREF _Toc242784277 \h </w:instrText>
+          <w:instrText xml:space="preserve"> PAGEREF _Toc242829601 \h </w:instrText>
         </w:r>
         <w:r>
           <w:rPr>
@@ -1220,7 +1220,7 @@
           <w14:ligatures w14:val="standardContextual"/>
         </w:rPr>
       </w:pPr>
-      <w:hyperlink w:anchor="_Toc242784278" w:history="1">
+      <w:hyperlink w:anchor="_Toc242829602" w:history="1">
         <w:r>
           <w:rPr>
             <w:rStyle w:val="Hyperlink"/>
@@ -1247,7 +1247,7 @@
             <w:noProof/>
             <w:webHidden/>
           </w:rPr>
-          <w:instrText xml:space="preserve"> PAGEREF _Toc242784278 \h </w:instrText>
+          <w:instrText xml:space="preserve"> PAGEREF _Toc242829602 \h </w:instrText>
         </w:r>
         <w:r>
           <w:rPr>
@@ -1296,7 +1296,7 @@
           <w14:ligatures w14:val="standardContextual"/>
         </w:rPr>
       </w:pPr>
-      <w:hyperlink w:anchor="_Toc242784279" w:history="1">
+      <w:hyperlink w:anchor="_Toc242829603" w:history="1">
         <w:r>
           <w:rPr>
             <w:rStyle w:val="Hyperlink"/>
@@ -1323,7 +1323,7 @@
             <w:noProof/>
             <w:webHidden/>
           </w:rPr>
-          <w:instrText xml:space="preserve"> PAGEREF _Toc242784279 \h </w:instrText>
+          <w:instrText xml:space="preserve"> PAGEREF _Toc242829603 \h </w:instrText>
         </w:r>
         <w:r>
           <w:rPr>
@@ -1372,7 +1372,7 @@
           <w14:ligatures w14:val="standardContextual"/>
         </w:rPr>
       </w:pPr>
-      <w:hyperlink w:anchor="_Toc242784280" w:history="1">
+      <w:hyperlink w:anchor="_Toc242829604" w:history="1">
         <w:r>
           <w:rPr>
             <w:rStyle w:val="Hyperlink"/>
@@ -1399,7 +1399,7 @@
             <w:noProof/>
             <w:webHidden/>
           </w:rPr>
-          <w:instrText xml:space="preserve"> PAGEREF _Toc242784280 \h </w:instrText>
+          <w:instrText xml:space="preserve"> PAGEREF _Toc242829604 \h </w:instrText>
         </w:r>
         <w:r>
           <w:rPr>
@@ -1446,7 +1446,7 @@
           <w14:ligatures w14:val="standardContextual"/>
         </w:rPr>
       </w:pPr>
-      <w:hyperlink w:anchor="_Toc242784281" w:history="1">
+      <w:hyperlink w:anchor="_Toc242829605" w:history="1">
         <w:r>
           <w:rPr>
             <w:rStyle w:val="Hyperlink"/>
@@ -1473,7 +1473,7 @@
             <w:noProof/>
             <w:webHidden/>
           </w:rPr>
-          <w:instrText xml:space="preserve"> PAGEREF _Toc242784281 \h </w:instrText>
+          <w:instrText xml:space="preserve"> PAGEREF _Toc242829605 \h </w:instrText>
         </w:r>
         <w:r>
           <w:rPr>
@@ -1520,7 +1520,7 @@
           <w14:ligatures w14:val="standardContextual"/>
         </w:rPr>
       </w:pPr>
-      <w:hyperlink w:anchor="_Toc242784282" w:history="1">
+      <w:hyperlink w:anchor="_Toc242829606" w:history="1">
         <w:r>
           <w:rPr>
             <w:rStyle w:val="Hyperlink"/>
@@ -1547,7 +1547,7 @@
             <w:noProof/>
             <w:webHidden/>
           </w:rPr>
-          <w:instrText xml:space="preserve"> PAGEREF _Toc242784282 \h </w:instrText>
+          <w:instrText xml:space="preserve"> PAGEREF _Toc242829606 \h </w:instrText>
         </w:r>
         <w:r>
           <w:rPr>
@@ -1594,7 +1594,7 @@
           <w14:ligatures w14:val="standardContextual"/>
         </w:rPr>
       </w:pPr>
-      <w:hyperlink w:anchor="_Toc242784283" w:history="1">
+      <w:hyperlink w:anchor="_Toc242829607" w:history="1">
         <w:r>
           <w:rPr>
             <w:rStyle w:val="Hyperlink"/>
@@ -1621,7 +1621,7 @@
             <w:noProof/>
             <w:webHidden/>
           </w:rPr>
-          <w:instrText xml:space="preserve"> PAGEREF _Toc242784283 \h </w:instrText>
+          <w:instrText xml:space="preserve"> PAGEREF _Toc242829607 \h </w:instrText>
         </w:r>
         <w:r>
           <w:rPr>
@@ -1668,7 +1668,7 @@
           <w14:ligatures w14:val="standardContextual"/>
         </w:rPr>
       </w:pPr>
-      <w:hyperlink w:anchor="_Toc242784284" w:history="1">
+      <w:hyperlink w:anchor="_Toc242829608" w:history="1">
         <w:r>
           <w:rPr>
             <w:rStyle w:val="Hyperlink"/>
@@ -1695,7 +1695,7 @@
             <w:noProof/>
             <w:webHidden/>
           </w:rPr>
-          <w:instrText xml:space="preserve"> PAGEREF _Toc242784284 \h </w:instrText>
+          <w:instrText xml:space="preserve"> PAGEREF _Toc242829608 \h </w:instrText>
         </w:r>
         <w:r>
           <w:rPr>
@@ -1744,7 +1744,7 @@
           <w14:ligatures w14:val="standardContextual"/>
         </w:rPr>
       </w:pPr>
-      <w:hyperlink w:anchor="_Toc242784285" w:history="1">
+      <w:hyperlink w:anchor="_Toc242829609" w:history="1">
         <w:r>
           <w:rPr>
             <w:rStyle w:val="Hyperlink"/>
@@ -1771,7 +1771,7 @@
             <w:noProof/>
             <w:webHidden/>
           </w:rPr>
-          <w:instrText xml:space="preserve"> PAGEREF _Toc242784285 \h </w:instrText>
+          <w:instrText xml:space="preserve"> PAGEREF _Toc242829609 \h </w:instrText>
         </w:r>
         <w:r>
           <w:rPr>
@@ -1791,7 +1791,7 @@
             <w:noProof/>
             <w:webHidden/>
           </w:rPr>
-          <w:t>7</w:t>
+          <w:t>8</w:t>
         </w:r>
         <w:r>
           <w:rPr>
@@ -1820,7 +1820,7 @@
           <w14:ligatures w14:val="standardContextual"/>
         </w:rPr>
       </w:pPr>
-      <w:hyperlink w:anchor="_Toc242784286" w:history="1">
+      <w:hyperlink w:anchor="_Toc242829610" w:history="1">
         <w:r>
           <w:rPr>
             <w:rStyle w:val="Hyperlink"/>
@@ -1847,7 +1847,7 @@
             <w:noProof/>
             <w:webHidden/>
           </w:rPr>
-          <w:instrText xml:space="preserve"> PAGEREF _Toc242784286 \h </w:instrText>
+          <w:instrText xml:space="preserve"> PAGEREF _Toc242829610 \h </w:instrText>
         </w:r>
         <w:r>
           <w:rPr>
@@ -1894,7 +1894,7 @@
           <w14:ligatures w14:val="standardContextual"/>
         </w:rPr>
       </w:pPr>
-      <w:hyperlink w:anchor="_Toc242784287" w:history="1">
+      <w:hyperlink w:anchor="_Toc242829611" w:history="1">
         <w:r>
           <w:rPr>
             <w:rStyle w:val="Hyperlink"/>
@@ -1921,7 +1921,7 @@
             <w:noProof/>
             <w:webHidden/>
           </w:rPr>
-          <w:instrText xml:space="preserve"> PAGEREF _Toc242784287 \h </w:instrText>
+          <w:instrText xml:space="preserve"> PAGEREF _Toc242829611 \h </w:instrText>
         </w:r>
         <w:r>
           <w:rPr>
@@ -1968,7 +1968,7 @@
           <w14:ligatures w14:val="standardContextual"/>
         </w:rPr>
       </w:pPr>
-      <w:hyperlink w:anchor="_Toc242784288" w:history="1">
+      <w:hyperlink w:anchor="_Toc242829612" w:history="1">
         <w:r>
           <w:rPr>
             <w:rStyle w:val="Hyperlink"/>
@@ -1995,7 +1995,7 @@
             <w:noProof/>
             <w:webHidden/>
           </w:rPr>
-          <w:instrText xml:space="preserve"> PAGEREF _Toc242784288 \h </w:instrText>
+          <w:instrText xml:space="preserve"> PAGEREF _Toc242829612 \h </w:instrText>
         </w:r>
         <w:r>
           <w:rPr>
@@ -2042,7 +2042,7 @@
           <w14:ligatures w14:val="standardContextual"/>
         </w:rPr>
       </w:pPr>
-      <w:hyperlink w:anchor="_Toc242784289" w:history="1">
+      <w:hyperlink w:anchor="_Toc242829613" w:history="1">
         <w:r>
           <w:rPr>
             <w:rStyle w:val="Hyperlink"/>
@@ -2069,7 +2069,7 @@
             <w:noProof/>
             <w:webHidden/>
           </w:rPr>
-          <w:instrText xml:space="preserve"> PAGEREF _Toc242784289 \h </w:instrText>
+          <w:instrText xml:space="preserve"> PAGEREF _Toc242829613 \h </w:instrText>
         </w:r>
         <w:r>
           <w:rPr>
@@ -2116,7 +2116,7 @@
           <w14:ligatures w14:val="standardContextual"/>
         </w:rPr>
       </w:pPr>
-      <w:hyperlink w:anchor="_Toc242784290" w:history="1">
+      <w:hyperlink w:anchor="_Toc242829614" w:history="1">
         <w:r>
           <w:rPr>
             <w:rStyle w:val="Hyperlink"/>
@@ -2143,7 +2143,7 @@
             <w:noProof/>
             <w:webHidden/>
           </w:rPr>
-          <w:instrText xml:space="preserve"> PAGEREF _Toc242784290 \h </w:instrText>
+          <w:instrText xml:space="preserve"> PAGEREF _Toc242829614 \h </w:instrText>
         </w:r>
         <w:r>
           <w:rPr>
@@ -2163,7 +2163,7 @@
             <w:noProof/>
             <w:webHidden/>
           </w:rPr>
-          <w:t>9</w:t>
+          <w:t>10</w:t>
         </w:r>
         <w:r>
           <w:rPr>
@@ -2192,7 +2192,7 @@
           <w14:ligatures w14:val="standardContextual"/>
         </w:rPr>
       </w:pPr>
-      <w:hyperlink w:anchor="_Toc242784291" w:history="1">
+      <w:hyperlink w:anchor="_Toc242829615" w:history="1">
         <w:r>
           <w:rPr>
             <w:rStyle w:val="Hyperlink"/>
@@ -2219,7 +2219,7 @@
             <w:noProof/>
             <w:webHidden/>
           </w:rPr>
-          <w:instrText xml:space="preserve"> PAGEREF _Toc242784291 \h </w:instrText>
+          <w:instrText xml:space="preserve"> PAGEREF _Toc242829615 \h </w:instrText>
         </w:r>
         <w:r>
           <w:rPr>
@@ -2266,7 +2266,7 @@
           <w14:ligatures w14:val="standardContextual"/>
         </w:rPr>
       </w:pPr>
-      <w:hyperlink w:anchor="_Toc242784292" w:history="1">
+      <w:hyperlink w:anchor="_Toc242829616" w:history="1">
         <w:r>
           <w:rPr>
             <w:rStyle w:val="Hyperlink"/>
@@ -2293,7 +2293,7 @@
             <w:noProof/>
             <w:webHidden/>
           </w:rPr>
-          <w:instrText xml:space="preserve"> PAGEREF _Toc242784292 \h </w:instrText>
+          <w:instrText xml:space="preserve"> PAGEREF _Toc242829616 \h </w:instrText>
         </w:r>
         <w:r>
           <w:rPr>
@@ -2340,7 +2340,7 @@
           <w14:ligatures w14:val="standardContextual"/>
         </w:rPr>
       </w:pPr>
-      <w:hyperlink w:anchor="_Toc242784293" w:history="1">
+      <w:hyperlink w:anchor="_Toc242829617" w:history="1">
         <w:r>
           <w:rPr>
             <w:rStyle w:val="Hyperlink"/>
@@ -2367,7 +2367,7 @@
             <w:noProof/>
             <w:webHidden/>
           </w:rPr>
-          <w:instrText xml:space="preserve"> PAGEREF _Toc242784293 \h </w:instrText>
+          <w:instrText xml:space="preserve"> PAGEREF _Toc242829617 \h </w:instrText>
         </w:r>
         <w:r>
           <w:rPr>
@@ -2414,7 +2414,7 @@
           <w14:ligatures w14:val="standardContextual"/>
         </w:rPr>
       </w:pPr>
-      <w:hyperlink w:anchor="_Toc242784294" w:history="1">
+      <w:hyperlink w:anchor="_Toc242829618" w:history="1">
         <w:r>
           <w:rPr>
             <w:rStyle w:val="Hyperlink"/>
@@ -2441,7 +2441,7 @@
             <w:noProof/>
             <w:webHidden/>
           </w:rPr>
-          <w:instrText xml:space="preserve"> PAGEREF _Toc242784294 \h </w:instrText>
+          <w:instrText xml:space="preserve"> PAGEREF _Toc242829618 \h </w:instrText>
         </w:r>
         <w:r>
           <w:rPr>
@@ -2461,7 +2461,7 @@
             <w:noProof/>
             <w:webHidden/>
           </w:rPr>
-          <w:t>10</w:t>
+          <w:t>11</w:t>
         </w:r>
         <w:r>
           <w:rPr>
@@ -2490,7 +2490,7 @@
           <w14:ligatures w14:val="standardContextual"/>
         </w:rPr>
       </w:pPr>
-      <w:hyperlink w:anchor="_Toc242784295" w:history="1">
+      <w:hyperlink w:anchor="_Toc242829619" w:history="1">
         <w:r>
           <w:rPr>
             <w:rStyle w:val="Hyperlink"/>
@@ -2517,7 +2517,7 @@
             <w:noProof/>
             <w:webHidden/>
           </w:rPr>
-          <w:instrText xml:space="preserve"> PAGEREF _Toc242784295 \h </w:instrText>
+          <w:instrText xml:space="preserve"> PAGEREF _Toc242829619 \h </w:instrText>
         </w:r>
         <w:r>
           <w:rPr>
@@ -2537,7 +2537,7 @@
             <w:noProof/>
             <w:webHidden/>
           </w:rPr>
-          <w:t>11</w:t>
+          <w:t>12</w:t>
         </w:r>
         <w:r>
           <w:rPr>
@@ -2566,7 +2566,7 @@
           <w14:ligatures w14:val="standardContextual"/>
         </w:rPr>
       </w:pPr>
-      <w:hyperlink w:anchor="_Toc242784296" w:history="1">
+      <w:hyperlink w:anchor="_Toc242829620" w:history="1">
         <w:r>
           <w:rPr>
             <w:rStyle w:val="Hyperlink"/>
@@ -2593,7 +2593,7 @@
             <w:noProof/>
             <w:webHidden/>
           </w:rPr>
-          <w:instrText xml:space="preserve"> PAGEREF _Toc242784296 \h </w:instrText>
+          <w:instrText xml:space="preserve"> PAGEREF _Toc242829620 \h </w:instrText>
         </w:r>
         <w:r>
           <w:rPr>
@@ -2613,7 +2613,7 @@
             <w:noProof/>
             <w:webHidden/>
           </w:rPr>
-          <w:t>12</w:t>
+          <w:t>13</w:t>
         </w:r>
         <w:r>
           <w:rPr>
@@ -2642,7 +2642,7 @@
           <w14:ligatures w14:val="standardContextual"/>
         </w:rPr>
       </w:pPr>
-      <w:hyperlink w:anchor="_Toc242784297" w:history="1">
+      <w:hyperlink w:anchor="_Toc242829621" w:history="1">
         <w:r>
           <w:rPr>
             <w:rStyle w:val="Hyperlink"/>
@@ -2669,7 +2669,7 @@
             <w:noProof/>
             <w:webHidden/>
           </w:rPr>
-          <w:instrText xml:space="preserve"> PAGEREF _Toc242784297 \h </w:instrText>
+          <w:instrText xml:space="preserve"> PAGEREF _Toc242829621 \h </w:instrText>
         </w:r>
         <w:r>
           <w:rPr>
@@ -2689,7 +2689,7 @@
             <w:noProof/>
             <w:webHidden/>
           </w:rPr>
-          <w:t>18</w:t>
+          <w:t>19</w:t>
         </w:r>
         <w:r>
           <w:rPr>
@@ -2716,7 +2716,7 @@
           <w14:ligatures w14:val="standardContextual"/>
         </w:rPr>
       </w:pPr>
-      <w:hyperlink w:anchor="_Toc242784298" w:history="1">
+      <w:hyperlink w:anchor="_Toc242829622" w:history="1">
         <w:r>
           <w:rPr>
             <w:rStyle w:val="Hyperlink"/>
@@ -2743,7 +2743,7 @@
             <w:noProof/>
             <w:webHidden/>
           </w:rPr>
-          <w:instrText xml:space="preserve"> PAGEREF _Toc242784298 \h </w:instrText>
+          <w:instrText xml:space="preserve"> PAGEREF _Toc242829622 \h </w:instrText>
         </w:r>
         <w:r>
           <w:rPr>
@@ -2763,7 +2763,7 @@
             <w:noProof/>
             <w:webHidden/>
           </w:rPr>
-          <w:t>18</w:t>
+          <w:t>19</w:t>
         </w:r>
         <w:r>
           <w:rPr>
@@ -2790,7 +2790,7 @@
           <w14:ligatures w14:val="standardContextual"/>
         </w:rPr>
       </w:pPr>
-      <w:hyperlink w:anchor="_Toc242784299" w:history="1">
+      <w:hyperlink w:anchor="_Toc242829623" w:history="1">
         <w:r>
           <w:rPr>
             <w:rStyle w:val="Hyperlink"/>
@@ -2817,7 +2817,7 @@
             <w:noProof/>
             <w:webHidden/>
           </w:rPr>
-          <w:instrText xml:space="preserve"> PAGEREF _Toc242784299 \h </w:instrText>
+          <w:instrText xml:space="preserve"> PAGEREF _Toc242829623 \h </w:instrText>
         </w:r>
         <w:r>
           <w:rPr>
@@ -2837,7 +2837,7 @@
             <w:noProof/>
             <w:webHidden/>
           </w:rPr>
-          <w:t>18</w:t>
+          <w:t>19</w:t>
         </w:r>
         <w:r>
           <w:rPr>
@@ -2866,7 +2866,7 @@
           <w14:ligatures w14:val="standardContextual"/>
         </w:rPr>
       </w:pPr>
-      <w:hyperlink w:anchor="_Toc242784300" w:history="1">
+      <w:hyperlink w:anchor="_Toc242829624" w:history="1">
         <w:r>
           <w:rPr>
             <w:rStyle w:val="Hyperlink"/>
@@ -2893,7 +2893,7 @@
             <w:noProof/>
             <w:webHidden/>
           </w:rPr>
-          <w:instrText xml:space="preserve"> PAGEREF _Toc242784300 \h </w:instrText>
+          <w:instrText xml:space="preserve"> PAGEREF _Toc242829624 \h </w:instrText>
         </w:r>
         <w:r>
           <w:rPr>
@@ -2913,7 +2913,7 @@
             <w:noProof/>
             <w:webHidden/>
           </w:rPr>
-          <w:t>18</w:t>
+          <w:t>19</w:t>
         </w:r>
         <w:r>
           <w:rPr>
@@ -2952,7 +2952,7 @@
         <w:pStyle w:val="Heading1"/>
         <w:spacing w:before="720" w:after="260"/>
       </w:pPr>
-      <w:bookmarkStart w:id="0" w:name="_Toc242784271"/>
+      <w:bookmarkStart w:id="0" w:name="_Toc242829595"/>
       <w:r>
         <w:rPr>
           <w:rFonts w:ascii="Calibri" w:eastAsia="Calibri" w:hAnsi="Calibri" w:cs="Calibri"/>
@@ -3000,7 +3000,7 @@
       <w:pPr>
         <w:pStyle w:val="Heading2"/>
       </w:pPr>
-      <w:bookmarkStart w:id="1" w:name="_Toc242784272"/>
+      <w:bookmarkStart w:id="1" w:name="_Toc242829596"/>
       <w:r>
         <w:t>1.1 Requisitos LUG (comunes a todos los TP individuales)</w:t>
       </w:r>
@@ -3154,7 +3154,7 @@
         <w:pStyle w:val="Heading1"/>
         <w:spacing w:before="720" w:after="260"/>
       </w:pPr>
-      <w:bookmarkStart w:id="2" w:name="_Toc242784273"/>
+      <w:bookmarkStart w:id="2" w:name="_Toc242829597"/>
       <w:r>
         <w:rPr>
           <w:rFonts w:ascii="Calibri" w:eastAsia="Calibri" w:hAnsi="Calibri" w:cs="Calibri"/>
@@ -3177,7 +3177,7 @@
         <w:pStyle w:val="Heading1"/>
         <w:spacing w:before="720" w:after="260"/>
       </w:pPr>
-      <w:bookmarkStart w:id="3" w:name="_Toc242784274"/>
+      <w:bookmarkStart w:id="3" w:name="_Toc242829598"/>
       <w:r>
         <w:rPr>
           <w:rFonts w:ascii="Calibri" w:eastAsia="Calibri" w:hAnsi="Calibri" w:cs="Calibri"/>
@@ -3190,7 +3190,7 @@
       <w:pPr>
         <w:pStyle w:val="Heading2"/>
       </w:pPr>
-      <w:bookmarkStart w:id="4" w:name="_Toc242784275"/>
+      <w:bookmarkStart w:id="4" w:name="_Toc242829599"/>
       <w:r>
         <w:t>3.1 Modalidad de juego</w:t>
       </w:r>
@@ -3267,7 +3267,7 @@
       <w:pPr>
         <w:pStyle w:val="Heading2"/>
       </w:pPr>
-      <w:bookmarkStart w:id="5" w:name="_Toc242784276"/>
+      <w:bookmarkStart w:id="5" w:name="_Toc242829600"/>
       <w:r>
         <w:t>3.2 Mecánica de un turno</w:t>
       </w:r>
@@ -3372,7 +3372,7 @@
       <w:pPr>
         <w:pStyle w:val="Heading2"/>
       </w:pPr>
-      <w:bookmarkStart w:id="6" w:name="_Toc242784277"/>
+      <w:bookmarkStart w:id="6" w:name="_Toc242829601"/>
       <w:r>
         <w:t>3.3 Cálculo de puntaje por categoría</w:t>
       </w:r>
@@ -4432,7 +4432,7 @@
       <w:pPr>
         <w:pStyle w:val="Heading2"/>
       </w:pPr>
-      <w:bookmarkStart w:id="7" w:name="_Toc242784278"/>
+      <w:bookmarkStart w:id="7" w:name="_Toc242829602"/>
       <w:r>
         <w:lastRenderedPageBreak/>
         <w:t>3.4 Fin de partida y abandono</w:t>
@@ -4512,7 +4512,7 @@
         <w:pStyle w:val="Heading1"/>
         <w:spacing w:before="720" w:after="260"/>
       </w:pPr>
-      <w:bookmarkStart w:id="8" w:name="_Toc242784279"/>
+      <w:bookmarkStart w:id="8" w:name="_Toc242829603"/>
       <w:r>
         <w:rPr>
           <w:rFonts w:ascii="Calibri" w:eastAsia="Calibri" w:hAnsi="Calibri" w:cs="Calibri"/>
@@ -5023,7 +5023,7 @@
         <w:pStyle w:val="Heading1"/>
         <w:spacing w:before="720" w:after="260"/>
       </w:pPr>
-      <w:bookmarkStart w:id="9" w:name="_Toc242784280"/>
+      <w:bookmarkStart w:id="9" w:name="_Toc242829604"/>
       <w:r>
         <w:rPr>
           <w:rFonts w:ascii="Calibri" w:eastAsia="Calibri" w:hAnsi="Calibri" w:cs="Calibri"/>
@@ -5037,7 +5037,7 @@
       <w:pPr>
         <w:pStyle w:val="Heading2"/>
       </w:pPr>
-      <w:bookmarkStart w:id="10" w:name="_Toc242784281"/>
+      <w:bookmarkStart w:id="10" w:name="_Toc242829605"/>
       <w:r>
         <w:t>5.1 BE: Entidades</w:t>
       </w:r>
@@ -5491,7 +5491,7 @@
                 <w:sz w:val="19"/>
                 <w:szCs w:val="19"/>
               </w:rPr>
-              <w:t>Una jugada leída del XML de la partida: turno, jugador, dados, categoría, puntaje y fecha.</w:t>
+              <w:t>Un movimiento leído del XML de la partida (tirada, anotación o fin): turno, jugador, acción, dados, dados guardados, categoría o resultado, puntaje y fecha.</w:t>
             </w:r>
           </w:p>
         </w:tc>
@@ -5663,7 +5663,7 @@
       <w:pPr>
         <w:pStyle w:val="Heading2"/>
       </w:pPr>
-      <w:bookmarkStart w:id="11" w:name="_Toc242784282"/>
+      <w:bookmarkStart w:id="11" w:name="_Toc242829606"/>
       <w:r>
         <w:t>5.2 DAL: Acceso a datos</w:t>
       </w:r>
@@ -6214,8 +6214,9 @@
       <w:pPr>
         <w:pStyle w:val="Heading2"/>
       </w:pPr>
-      <w:bookmarkStart w:id="12" w:name="_Toc242784283"/>
-      <w:r>
+      <w:bookmarkStart w:id="12" w:name="_Toc242829607"/>
+      <w:r>
+        <w:lastRenderedPageBreak/>
         <w:t>5.3 BLL: Lógica de negocio</w:t>
       </w:r>
       <w:bookmarkEnd w:id="12"/>
@@ -6454,7 +6455,7 @@
                 <w:sz w:val="19"/>
                 <w:szCs w:val="19"/>
               </w:rPr>
-              <w:t>Maneja la partida completa y su estado: jugadores, turno, tiradas restantes, dados y planilla. Iniciar, Tirar, CategoriasDisponibles, CalcularPuntaje, Anotar (registra el movimiento en el XML y pasa el turno), Abandonar y el cierre con el ganador. Dispara el evento PartidaFinalizada.</w:t>
+              <w:t>Maneja la partida completa y su estado: jugadores, turno, tiradas restantes, dados y planilla. Iniciar, Tirar (registra la tirada en el XML), CategoriasDisponibles, CalcularPuntaje, Anotar (registra la anotación en el XML y pasa el turno), Abandonar y el cierre con el ganador (registra el fin en el XML). Dispara el evento PartidaFinalizada.</w:t>
             </w:r>
           </w:p>
         </w:tc>
@@ -6812,7 +6813,7 @@
                 <w:sz w:val="19"/>
                 <w:szCs w:val="19"/>
               </w:rPr>
-              <w:t>Crea el archivo XML de cada partida, le agrega un nodo por cada jugada y lo vuelve a leer para consultarlo (LeerMovimientos).</w:t>
+              <w:t>Crea el archivo XML de cada partida, le agrega un nodo por cada tirada (RegistrarTirada), cada anotación (RegistrarMovimiento) y el cierre (RegistrarFin), y lo vuelve a leer para consultarlo (LeerMovimientos).</w:t>
             </w:r>
           </w:p>
         </w:tc>
@@ -6903,7 +6904,7 @@
       <w:pPr>
         <w:pStyle w:val="Heading2"/>
       </w:pPr>
-      <w:bookmarkStart w:id="13" w:name="_Toc242784284"/>
+      <w:bookmarkStart w:id="13" w:name="_Toc242829608"/>
       <w:r>
         <w:t>5.4 GUI: Presentación</w:t>
       </w:r>
@@ -7357,7 +7358,7 @@
                 <w:sz w:val="19"/>
                 <w:szCs w:val="19"/>
               </w:rPr>
-              <w:t>Muestra en una grilla los movimientos guardados en el XML de la partida elegida.</w:t>
+              <w:t>Muestra en una grilla los movimientos guardados en el XML de la partida elegida: tiradas, anotaciones (en negrita) y el cierre (resaltado).</w:t>
             </w:r>
           </w:p>
         </w:tc>
@@ -7449,11 +7450,12 @@
         <w:pStyle w:val="Heading1"/>
         <w:spacing w:before="720" w:after="260"/>
       </w:pPr>
-      <w:bookmarkStart w:id="14" w:name="_Toc242784285"/>
+      <w:bookmarkStart w:id="14" w:name="_Toc242829609"/>
       <w:r>
         <w:rPr>
           <w:rFonts w:ascii="Calibri" w:eastAsia="Calibri" w:hAnsi="Calibri" w:cs="Calibri"/>
         </w:rPr>
+        <w:lastRenderedPageBreak/>
         <w:t>6. Modelo de datos</w:t>
       </w:r>
       <w:bookmarkEnd w:id="14"/>
@@ -7992,6 +7994,7 @@
           <w:sz w:val="19"/>
           <w:szCs w:val="19"/>
         </w:rPr>
+        <w:lastRenderedPageBreak/>
         <w:t>Tabla 3. Stored procedures</w:t>
       </w:r>
     </w:p>
@@ -8598,7 +8601,7 @@
         <w:pStyle w:val="Heading1"/>
         <w:spacing w:before="720" w:after="260"/>
       </w:pPr>
-      <w:bookmarkStart w:id="15" w:name="_Toc242784286"/>
+      <w:bookmarkStart w:id="15" w:name="_Toc242829610"/>
       <w:r>
         <w:rPr>
           <w:rFonts w:ascii="Calibri" w:eastAsia="Calibri" w:hAnsi="Calibri" w:cs="Calibri"/>
@@ -8611,7 +8614,7 @@
       <w:pPr>
         <w:pStyle w:val="Heading2"/>
       </w:pPr>
-      <w:bookmarkStart w:id="16" w:name="_Toc242784287"/>
+      <w:bookmarkStart w:id="16" w:name="_Toc242829611"/>
       <w:r>
         <w:t>7.1 Juego</w:t>
       </w:r>
@@ -8673,7 +8676,7 @@
       <w:pPr>
         <w:pStyle w:val="Heading2"/>
       </w:pPr>
-      <w:bookmarkStart w:id="17" w:name="_Toc242784288"/>
+      <w:bookmarkStart w:id="17" w:name="_Toc242829612"/>
       <w:r>
         <w:t>7.2 Usuarios y sesión</w:t>
       </w:r>
@@ -8719,7 +8722,7 @@
       <w:pPr>
         <w:pStyle w:val="Heading2"/>
       </w:pPr>
-      <w:bookmarkStart w:id="18" w:name="_Toc242784289"/>
+      <w:bookmarkStart w:id="18" w:name="_Toc242829613"/>
       <w:r>
         <w:t>7.3 Registro y persistencia</w:t>
       </w:r>
@@ -8748,17 +8751,7 @@
         <w:spacing w:after="70" w:line="276" w:lineRule="auto"/>
       </w:pPr>
       <w:r>
-        <w:t xml:space="preserve">Archivo XML propio por partida con cada movimiento, consultable desde </w:t>
-      </w:r>
-      <w:r>
-        <w:rPr>
-          <w:i/>
-          <w:iCs/>
-        </w:rPr>
-        <w:t>Estadísticas → Ver movimientos</w:t>
-      </w:r>
-      <w:r>
-        <w:t xml:space="preserve"> (ver sección 8.2).</w:t>
+        <w:t>Archivo XML propio por partida con cada tirada, cada anotación y el cierre, consultable desde Estadísticas → Ver movimientos (ver sección 8.2).</w:t>
       </w:r>
     </w:p>
     <w:p>
@@ -8791,8 +8784,9 @@
       <w:pPr>
         <w:pStyle w:val="Heading2"/>
       </w:pPr>
-      <w:bookmarkStart w:id="19" w:name="_Toc242784290"/>
-      <w:r>
+      <w:bookmarkStart w:id="19" w:name="_Toc242829614"/>
+      <w:r>
+        <w:lastRenderedPageBreak/>
         <w:t>7.4 Robustez</w:t>
       </w:r>
       <w:bookmarkEnd w:id="19"/>
@@ -8892,7 +8886,7 @@
         <w:pStyle w:val="Heading1"/>
         <w:spacing w:before="720" w:after="260"/>
       </w:pPr>
-      <w:bookmarkStart w:id="20" w:name="_Toc242784291"/>
+      <w:bookmarkStart w:id="20" w:name="_Toc242829615"/>
       <w:r>
         <w:rPr>
           <w:rFonts w:ascii="Calibri" w:eastAsia="Calibri" w:hAnsi="Calibri" w:cs="Calibri"/>
@@ -8905,7 +8899,7 @@
       <w:pPr>
         <w:pStyle w:val="Heading2"/>
       </w:pPr>
-      <w:bookmarkStart w:id="21" w:name="_Toc242784292"/>
+      <w:bookmarkStart w:id="21" w:name="_Toc242829616"/>
       <w:r>
         <w:t>8.1 Bitácora</w:t>
       </w:r>
@@ -9505,7 +9499,7 @@
       <w:pPr>
         <w:pStyle w:val="Heading2"/>
       </w:pPr>
-      <w:bookmarkStart w:id="22" w:name="_Toc242784293"/>
+      <w:bookmarkStart w:id="22" w:name="_Toc242829617"/>
       <w:r>
         <w:t>8.2 Registro de movimientos en XML</w:t>
       </w:r>
@@ -9517,71 +9511,14 @@
         <w:jc w:val="both"/>
       </w:pPr>
       <w:r>
-        <w:t xml:space="preserve">Al iniciar cada partida, </w:t>
-      </w:r>
-      <w:r>
-        <w:rPr>
-          <w:rFonts w:ascii="Consolas" w:eastAsia="Consolas" w:hAnsi="Consolas" w:cs="Consolas"/>
-          <w:color w:val="8B1E45"/>
-          <w:sz w:val="19"/>
-          <w:szCs w:val="19"/>
-        </w:rPr>
-        <w:t>MOVIMIENTOXML</w:t>
-      </w:r>
-      <w:r>
-        <w:t xml:space="preserve"> crea un archivo en la carpeta </w:t>
-      </w:r>
-      <w:r>
-        <w:rPr>
-          <w:b/>
-          <w:bCs/>
-        </w:rPr>
-        <w:t>Partidas</w:t>
-      </w:r>
-      <w:r>
-        <w:t xml:space="preserve"> junto al ejecutable, con el nombre </w:t>
-      </w:r>
-      <w:r>
-        <w:rPr>
-          <w:rFonts w:ascii="Consolas" w:eastAsia="Consolas" w:hAnsi="Consolas" w:cs="Consolas"/>
-          <w:color w:val="8B1E45"/>
-          <w:sz w:val="19"/>
-          <w:szCs w:val="19"/>
-        </w:rPr>
-        <w:t>Partida_aaaaMMdd_HHmmssfff.xml</w:t>
-      </w:r>
-      <w:r>
-        <w:t xml:space="preserve">, y su ruta queda guardada en </w:t>
-      </w:r>
-      <w:r>
-        <w:rPr>
-          <w:rFonts w:ascii="Consolas" w:eastAsia="Consolas" w:hAnsi="Consolas" w:cs="Consolas"/>
-          <w:color w:val="8B1E45"/>
-          <w:sz w:val="19"/>
-          <w:szCs w:val="19"/>
-        </w:rPr>
-        <w:t>PARTIDA.RUTA_XML</w:t>
-      </w:r>
-      <w:r>
-        <w:t xml:space="preserve"> para poder ubicarlo después. Cada vez que un jugador anota una categoría se agrega un nodo </w:t>
-      </w:r>
-      <w:r>
-        <w:rPr>
-          <w:rFonts w:ascii="Consolas" w:eastAsia="Consolas" w:hAnsi="Consolas" w:cs="Consolas"/>
-          <w:color w:val="8B1E45"/>
-          <w:sz w:val="19"/>
-          <w:szCs w:val="19"/>
-        </w:rPr>
-        <w:t>Movimiento</w:t>
-      </w:r>
-      <w:r>
-        <w:t>:</w:t>
+        <w:t>Al iniciar cada partida, MOVIMIENTOXML crea un archivo en la carpeta Partidas junto al ejecutable, con el nombre Partida_aaaaMMdd_HHmmssfff.xml y los nombres de los dos jugadores, y su ruta queda guardada en PARTIDA.RUTA_XML para poder ubicarlo después. Durante la partida se agregan tres tipos de nodos: Tirada en cada tirada de dados (número de tirada del turno, dados que salieron y posiciones de los dados que se guardaron), Movimiento cada vez que un jugador anota una categoría, y Fin al cerrar la partida (puntajes, ganador y, si corresponde, quién abandonó):</w:t>
       </w:r>
     </w:p>
     <w:p>
       <w:pPr>
         <w:keepNext/>
-        <w:spacing w:before="120" w:line="252" w:lineRule="auto"/>
+        <w:keepLines/>
+        <w:spacing w:before="120" w:after="200" w:line="252" w:lineRule="auto"/>
         <w:ind w:left="567"/>
       </w:pPr>
       <w:r>
@@ -9591,15 +9528,9 @@
           <w:sz w:val="17"/>
           <w:szCs w:val="17"/>
         </w:rPr>
-        <w:t>&lt;Partida fecha="10/10/2026 18:42:07"&gt;</w:t>
-      </w:r>
-    </w:p>
-    <w:p>
-      <w:pPr>
-        <w:keepNext/>
-        <w:spacing w:line="252" w:lineRule="auto"/>
-        <w:ind w:left="567"/>
-      </w:pPr>
+        <w:lastRenderedPageBreak/>
+        <w:t>&lt;Partida fecha="10/10/2026 18:42:07" jugador1="valentina" jugador2="jugador2"&gt;</w:t>
+      </w:r>
       <w:r>
         <w:rPr>
           <w:rFonts w:ascii="Consolas" w:eastAsia="Consolas" w:hAnsi="Consolas" w:cs="Consolas"/>
@@ -9607,15 +9538,9 @@
           <w:sz w:val="17"/>
           <w:szCs w:val="17"/>
         </w:rPr>
-        <w:t xml:space="preserve">  &lt;Movimiento turno="1" jugador="valentina" dados="3,3,3,5,5"</w:t>
-      </w:r>
-    </w:p>
-    <w:p>
-      <w:pPr>
-        <w:keepNext/>
-        <w:spacing w:line="252" w:lineRule="auto"/>
-        <w:ind w:left="567"/>
-      </w:pPr>
+        <w:br/>
+        <w:t xml:space="preserve">  &lt;Tirada turno="1" jugador="valentina" numero="1" dados="3,3,1,5,6"</w:t>
+      </w:r>
       <w:r>
         <w:rPr>
           <w:rFonts w:ascii="Consolas" w:eastAsia="Consolas" w:hAnsi="Consolas" w:cs="Consolas"/>
@@ -9623,15 +9548,9 @@
           <w:sz w:val="17"/>
           <w:szCs w:val="17"/>
         </w:rPr>
-        <w:t xml:space="preserve">              categoria="Full" puntaje="30" fecha="10/10/2026 18:42:31" /&gt;</w:t>
-      </w:r>
-    </w:p>
-    <w:p>
-      <w:pPr>
-        <w:keepNext/>
-        <w:spacing w:line="252" w:lineRule="auto"/>
-        <w:ind w:left="567"/>
-      </w:pPr>
+        <w:br/>
+        <w:t xml:space="preserve">          guardados="" fecha="10/10/2026 18:42:15" /&gt;</w:t>
+      </w:r>
       <w:r>
         <w:rPr>
           <w:rFonts w:ascii="Consolas" w:eastAsia="Consolas" w:hAnsi="Consolas" w:cs="Consolas"/>
@@ -9639,15 +9558,9 @@
           <w:sz w:val="17"/>
           <w:szCs w:val="17"/>
         </w:rPr>
-        <w:t xml:space="preserve">  &lt;Movimiento turno="2" jugador="jugador2" dados="1,2,3,4,5"</w:t>
-      </w:r>
-    </w:p>
-    <w:p>
-      <w:pPr>
-        <w:keepNext/>
-        <w:spacing w:line="252" w:lineRule="auto"/>
-        <w:ind w:left="567"/>
-      </w:pPr>
+        <w:br/>
+        <w:t xml:space="preserve">  &lt;Tirada turno="1" jugador="valentina" numero="2" dados="3,3,3,5,5"</w:t>
+      </w:r>
       <w:r>
         <w:rPr>
           <w:rFonts w:ascii="Consolas" w:eastAsia="Consolas" w:hAnsi="Consolas" w:cs="Consolas"/>
@@ -9655,15 +9568,9 @@
           <w:sz w:val="17"/>
           <w:szCs w:val="17"/>
         </w:rPr>
-        <w:t xml:space="preserve">              categoria="Escalera" puntaje="40" fecha="10/10/2026 18:42:58" /&gt;</w:t>
-      </w:r>
-    </w:p>
-    <w:p>
-      <w:pPr>
-        <w:keepNext/>
-        <w:spacing w:line="252" w:lineRule="auto"/>
-        <w:ind w:left="567"/>
-      </w:pPr>
+        <w:br/>
+        <w:t xml:space="preserve">          guardados="1,2,4" fecha="10/10/2026 18:42:24" /&gt;</w:t>
+      </w:r>
       <w:r>
         <w:rPr>
           <w:rFonts w:ascii="Consolas" w:eastAsia="Consolas" w:hAnsi="Consolas" w:cs="Consolas"/>
@@ -9671,14 +9578,9 @@
           <w:sz w:val="17"/>
           <w:szCs w:val="17"/>
         </w:rPr>
-        <w:t xml:space="preserve">  ...</w:t>
-      </w:r>
-    </w:p>
-    <w:p>
-      <w:pPr>
-        <w:spacing w:after="160" w:line="252" w:lineRule="auto"/>
-        <w:ind w:left="567"/>
-      </w:pPr>
+        <w:br/>
+        <w:t xml:space="preserve">  &lt;Movimiento turno="1" jugador="valentina" dados="3,3,3,5,5"</w:t>
+      </w:r>
       <w:r>
         <w:rPr>
           <w:rFonts w:ascii="Consolas" w:eastAsia="Consolas" w:hAnsi="Consolas" w:cs="Consolas"/>
@@ -9686,6 +9588,97 @@
           <w:sz w:val="17"/>
           <w:szCs w:val="17"/>
         </w:rPr>
+        <w:br/>
+        <w:t xml:space="preserve">              categoria="Full" puntaje="30" fecha="10/10/2026 18:42:31" /&gt;</w:t>
+      </w:r>
+      <w:r>
+        <w:rPr>
+          <w:rFonts w:ascii="Consolas" w:eastAsia="Consolas" w:hAnsi="Consolas" w:cs="Consolas"/>
+          <w:color w:val="333333"/>
+          <w:sz w:val="17"/>
+          <w:szCs w:val="17"/>
+        </w:rPr>
+        <w:br/>
+        <w:t xml:space="preserve">  &lt;Tirada turno="2" jugador="jugador2" numero="1" dados="1,2,3,4,5"</w:t>
+      </w:r>
+      <w:r>
+        <w:rPr>
+          <w:rFonts w:ascii="Consolas" w:eastAsia="Consolas" w:hAnsi="Consolas" w:cs="Consolas"/>
+          <w:color w:val="333333"/>
+          <w:sz w:val="17"/>
+          <w:szCs w:val="17"/>
+        </w:rPr>
+        <w:br/>
+        <w:t xml:space="preserve">          guardados="" fecha="10/10/2026 18:42:50" /&gt;</w:t>
+      </w:r>
+      <w:r>
+        <w:rPr>
+          <w:rFonts w:ascii="Consolas" w:eastAsia="Consolas" w:hAnsi="Consolas" w:cs="Consolas"/>
+          <w:color w:val="333333"/>
+          <w:sz w:val="17"/>
+          <w:szCs w:val="17"/>
+        </w:rPr>
+        <w:br/>
+        <w:t xml:space="preserve">  &lt;Movimiento turno="2" jugador="jugador2" dados="1,2,3,4,5"</w:t>
+      </w:r>
+      <w:r>
+        <w:rPr>
+          <w:rFonts w:ascii="Consolas" w:eastAsia="Consolas" w:hAnsi="Consolas" w:cs="Consolas"/>
+          <w:color w:val="333333"/>
+          <w:sz w:val="17"/>
+          <w:szCs w:val="17"/>
+        </w:rPr>
+        <w:br/>
+        <w:t xml:space="preserve">              categoria="Escalera" puntaje="40" fecha="10/10/2026 18:42:58" /&gt;</w:t>
+      </w:r>
+      <w:r>
+        <w:rPr>
+          <w:rFonts w:ascii="Consolas" w:eastAsia="Consolas" w:hAnsi="Consolas" w:cs="Consolas"/>
+          <w:color w:val="333333"/>
+          <w:sz w:val="17"/>
+          <w:szCs w:val="17"/>
+        </w:rPr>
+        <w:br/>
+        <w:t xml:space="preserve">  ...</w:t>
+      </w:r>
+      <w:r>
+        <w:rPr>
+          <w:rFonts w:ascii="Consolas" w:eastAsia="Consolas" w:hAnsi="Consolas" w:cs="Consolas"/>
+          <w:color w:val="333333"/>
+          <w:sz w:val="17"/>
+          <w:szCs w:val="17"/>
+        </w:rPr>
+        <w:br/>
+        <w:t xml:space="preserve">  &lt;Fin turnos="22" jugador1="valentina" puntajeJugador1="215"</w:t>
+      </w:r>
+      <w:r>
+        <w:rPr>
+          <w:rFonts w:ascii="Consolas" w:eastAsia="Consolas" w:hAnsi="Consolas" w:cs="Consolas"/>
+          <w:color w:val="333333"/>
+          <w:sz w:val="17"/>
+          <w:szCs w:val="17"/>
+        </w:rPr>
+        <w:br/>
+        <w:t xml:space="preserve">       jugador2="jugador2" puntajeJugador2="198" ganador="valentina"</w:t>
+      </w:r>
+      <w:r>
+        <w:rPr>
+          <w:rFonts w:ascii="Consolas" w:eastAsia="Consolas" w:hAnsi="Consolas" w:cs="Consolas"/>
+          <w:color w:val="333333"/>
+          <w:sz w:val="17"/>
+          <w:szCs w:val="17"/>
+        </w:rPr>
+        <w:br/>
+        <w:t xml:space="preserve">       abandonada="no" abandono="" fecha="10/10/2026 19:05:12" /&gt;</w:t>
+      </w:r>
+      <w:r>
+        <w:rPr>
+          <w:rFonts w:ascii="Consolas" w:eastAsia="Consolas" w:hAnsi="Consolas" w:cs="Consolas"/>
+          <w:color w:val="333333"/>
+          <w:sz w:val="17"/>
+          <w:szCs w:val="17"/>
+        </w:rPr>
+        <w:br/>
         <w:t>&lt;/Partida&gt;</w:t>
       </w:r>
     </w:p>
@@ -9695,7 +9688,7 @@
         <w:jc w:val="both"/>
       </w:pPr>
       <w:r>
-        <w:t>En el ejemplo, la segunda jugada es una escalera servida (20 × 2).</w:t>
+        <w:t>En el ejemplo, valentina guarda los dados 1, 2 y 4 para la segunda tirada y anota Full; la anotación de jugador2 es una escalera servida (20 × 2), lograda en la primera tirada del turno.</w:t>
       </w:r>
     </w:p>
     <w:p>
@@ -9704,68 +9697,14 @@
         <w:jc w:val="both"/>
       </w:pPr>
       <w:r>
-        <w:t xml:space="preserve">Para su </w:t>
-      </w:r>
-      <w:r>
-        <w:rPr>
-          <w:b/>
-          <w:bCs/>
-        </w:rPr>
-        <w:t>posterior consulta</w:t>
-      </w:r>
-      <w:r>
-        <w:t xml:space="preserve">, en </w:t>
-      </w:r>
-      <w:r>
-        <w:rPr>
-          <w:i/>
-          <w:iCs/>
-        </w:rPr>
-        <w:t>Estadísticas</w:t>
-      </w:r>
-      <w:r>
-        <w:t xml:space="preserve"> se elige una partida del historial y el botón </w:t>
-      </w:r>
-      <w:r>
-        <w:rPr>
-          <w:i/>
-          <w:iCs/>
-        </w:rPr>
-        <w:t>Ver movimientos</w:t>
-      </w:r>
-      <w:r>
-        <w:t xml:space="preserve"> lee el archivo con </w:t>
-      </w:r>
-      <w:r>
-        <w:rPr>
-          <w:rFonts w:ascii="Consolas" w:eastAsia="Consolas" w:hAnsi="Consolas" w:cs="Consolas"/>
-          <w:color w:val="8B1E45"/>
-          <w:sz w:val="19"/>
-          <w:szCs w:val="19"/>
-        </w:rPr>
-        <w:t>MOVIMIENTOXML.LeerMovimientos</w:t>
-      </w:r>
-      <w:r>
-        <w:t xml:space="preserve"> y lo muestra en </w:t>
-      </w:r>
-      <w:r>
-        <w:rPr>
-          <w:rFonts w:ascii="Consolas" w:eastAsia="Consolas" w:hAnsi="Consolas" w:cs="Consolas"/>
-          <w:color w:val="8B1E45"/>
-          <w:sz w:val="19"/>
-          <w:szCs w:val="19"/>
-        </w:rPr>
-        <w:t>FormMovimientos</w:t>
-      </w:r>
-      <w:r>
-        <w:t>. Si el archivo ya no existe, la aplicación lo avisa.</w:t>
+        <w:t>Para su posterior consulta, en Estadísticas se elige una partida del historial y el botón Ver movimientos lee el archivo con MOVIMIENTOXML.LeerMovimientos y lo muestra en FormMovimientos, en orden: las tiradas, las anotaciones en negrita y el cierre resaltado al final. Si el archivo ya no existe o está dañado, la aplicación lo avisa.</w:t>
       </w:r>
     </w:p>
     <w:p>
       <w:pPr>
         <w:pStyle w:val="Heading2"/>
       </w:pPr>
-      <w:bookmarkStart w:id="23" w:name="_Toc242784294"/>
+      <w:bookmarkStart w:id="23" w:name="_Toc242829618"/>
       <w:r>
         <w:t>8.3 Estadísticas</w:t>
       </w:r>
@@ -10104,7 +10043,7 @@
                 <w:sz w:val="19"/>
                 <w:szCs w:val="19"/>
               </w:rPr>
-              <w:t>Suma de (fecha de fin − fecha de inicio) de todas las partidas, en horas y minutos.</w:t>
+              <w:t>Suma de (fecha de fin − fecha de inicio) de todas las partidas, en horas, minutos y segundos.</w:t>
             </w:r>
           </w:p>
         </w:tc>
@@ -10116,11 +10055,12 @@
         <w:pageBreakBefore/>
         <w:spacing w:before="720" w:after="260"/>
       </w:pPr>
-      <w:bookmarkStart w:id="24" w:name="_Toc242784295"/>
+      <w:bookmarkStart w:id="24" w:name="_Toc242829619"/>
       <w:r>
         <w:rPr>
           <w:rFonts w:ascii="Calibri" w:eastAsia="Calibri" w:hAnsi="Calibri" w:cs="Calibri"/>
         </w:rPr>
+        <w:lastRenderedPageBreak/>
         <w:t>9. Matriz de cumplimiento de la consigna</w:t>
       </w:r>
       <w:bookmarkEnd w:id="24"/>
@@ -13078,11 +13018,12 @@
         <w:pStyle w:val="Heading1"/>
         <w:spacing w:before="720" w:after="260"/>
       </w:pPr>
-      <w:bookmarkStart w:id="25" w:name="_Toc242784296"/>
+      <w:bookmarkStart w:id="25" w:name="_Toc242829620"/>
       <w:r>
         <w:rPr>
           <w:rFonts w:ascii="Calibri" w:eastAsia="Calibri" w:hAnsi="Calibri" w:cs="Calibri"/>
         </w:rPr>
+        <w:lastRenderedPageBreak/>
         <w:t>10. Diagramas de clases</w:t>
       </w:r>
       <w:bookmarkEnd w:id="25"/>
@@ -13110,6 +13051,7 @@
         <w:rPr>
           <w:noProof/>
         </w:rPr>
+        <w:lastRenderedPageBreak/>
         <w:drawing>
           <wp:inline distT="0" distB="0" distL="0" distR="0" wp14:anchorId="6897AF64" wp14:editId="37A9E84C">
             <wp:extent cx="5090915" cy="5334000"/>
@@ -13447,7 +13389,7 @@
           <w:noProof/>
         </w:rPr>
         <w:drawing>
-          <wp:inline distT="0" distB="0" distL="0" distR="0" wp14:anchorId="0610FB9C" wp14:editId="55CEA3EE">
+          <wp:inline distT="0" distB="0" distL="0" distR="0" wp14:anchorId="0610FB9C" wp14:editId="5473CEF3">
             <wp:extent cx="8778240" cy="4902695"/>
             <wp:effectExtent l="0" t="0" r="3810" b="0"/>
             <wp:docPr id="819468357" name="Picture 5"/>
@@ -13532,11 +13474,12 @@
         <w:pStyle w:val="Heading1"/>
         <w:spacing w:before="720" w:after="260"/>
       </w:pPr>
-      <w:bookmarkStart w:id="26" w:name="_Toc242784297"/>
+      <w:bookmarkStart w:id="26" w:name="_Toc242829621"/>
       <w:r>
         <w:rPr>
           <w:rFonts w:ascii="Calibri" w:eastAsia="Calibri" w:hAnsi="Calibri" w:cs="Calibri"/>
         </w:rPr>
+        <w:lastRenderedPageBreak/>
         <w:t>11. Instalación y ejecución</w:t>
       </w:r>
       <w:bookmarkEnd w:id="26"/>
@@ -13545,7 +13488,7 @@
       <w:pPr>
         <w:pStyle w:val="Heading2"/>
       </w:pPr>
-      <w:bookmarkStart w:id="27" w:name="_Toc242784298"/>
+      <w:bookmarkStart w:id="27" w:name="_Toc242829622"/>
       <w:r>
         <w:t>11.1 Requisitos</w:t>
       </w:r>
@@ -13593,7 +13536,7 @@
       <w:pPr>
         <w:pStyle w:val="Heading2"/>
       </w:pPr>
-      <w:bookmarkStart w:id="28" w:name="_Toc242784299"/>
+      <w:bookmarkStart w:id="28" w:name="_Toc242829623"/>
       <w:r>
         <w:t>11.2 Pasos</w:t>
       </w:r>
@@ -14039,7 +13982,7 @@
         <w:pStyle w:val="Heading1"/>
         <w:spacing w:before="720" w:after="260"/>
       </w:pPr>
-      <w:bookmarkStart w:id="29" w:name="_Toc242784300"/>
+      <w:bookmarkStart w:id="29" w:name="_Toc242829624"/>
       <w:r>
         <w:rPr>
           <w:rFonts w:ascii="Calibri" w:eastAsia="Calibri" w:hAnsi="Calibri" w:cs="Calibri"/>

</xml_diff>